<commit_message>
Draft_009: apply appendix merge and framing rewrite
- Appendix A: quick-reference + full codebook (D5 tables/Georgia kept)
- Appendix B: pilot intro/observation rewritten; samples retained
- Appendix C: coded corpus (old D, content unchanged)
- Main body remains Draft_008 (accuracy + tense fixes)
</commit_message>
<xml_diff>
--- a/thesis/003_ThesisProposal_Draft_009.docx
+++ b/thesis/003_ThesisProposal_Draft_009.docx
@@ -7363,36 +7363,59 @@
           <w:i w:val="0"/>
           <w:sz w:val="28"/>
         </w:rPr>
-        <w:t>APPENDIX A: CODING KEY FOR HEDGE IDENTIFICATION</w:t>
+      </w:r>
+      <w:r>
+        <w:rPr>
+          <w:rFonts w:ascii="Georgia" w:hAnsi="Georgia" w:cs="Georgia"/>
+          <w:b/>
+          <w:sz w:val="28"/>
+        </w:rPr>
+        <w:t>APPENDIX A: HEDGING CODEBOOK</w:t>
       </w:r>
     </w:p>
     <w:p>
       <w:pPr>
         <w:spacing w:before="0" w:after="0" w:line="240" w:lineRule="auto"/>
-      </w:pPr>
-      <w:r>
-        <w:rPr>
-          <w:rFonts w:ascii="Georgia" w:hAnsi="Georgia" w:eastAsia="Georgia"/>
-          <w:b w:val="0"/>
-          <w:i w:val="0"/>
-          <w:sz w:val="22"/>
-        </w:rPr>
+        <w:jc w:val="left"/>
+      </w:pPr>
+      <w:r>
+        <w:rPr>
+          <w:rFonts w:ascii="Georgia" w:hAnsi="Georgia" w:eastAsia="Georgia"/>
+          <w:b w:val="0"/>
+          <w:i w:val="0"/>
+          <w:sz w:val="22"/>
+        </w:rPr>
+      </w:r>
+      <w:r>
+        <w:rPr>
+          <w:rFonts w:ascii="Georgia" w:hAnsi="Georgia" w:cs="Georgia"/>
+          <w:b w:val="0"/>
+          <w:sz w:val="22"/>
+        </w:rPr>
+        <w:t>This appendix is the full coding protocol used for the study. It opens with a one-page quick-reference, then gives the operational layers, decision rules, false-positive categories, and recording conventions.</w:t>
       </w:r>
     </w:p>
     <w:p>
       <w:pPr>
         <w:spacing w:line="480" w:lineRule="auto" w:before="0" w:after="0"/>
         <w:ind w:firstLine="720"/>
-        <w:jc w:val="both"/>
-      </w:pPr>
-      <w:r>
-        <w:rPr>
-          <w:rFonts w:ascii="Georgia" w:hAnsi="Georgia" w:eastAsia="Georgia"/>
-          <w:b w:val="0"/>
-          <w:i w:val="0"/>
-          <w:sz w:val="22"/>
-        </w:rPr>
-        <w:t>A coding key based on Hyland’s (1998) framework was developed to classify hedges by type and function. All coding is context-sensitive. Devices are classified based on their function in the sentence in which they appear, not on their presence in isolation.</w:t>
+        <w:jc w:val="left"/>
+      </w:pPr>
+      <w:r>
+        <w:rPr>
+          <w:rFonts w:ascii="Georgia" w:hAnsi="Georgia" w:eastAsia="Georgia"/>
+          <w:b w:val="0"/>
+          <w:i w:val="0"/>
+          <w:sz w:val="22"/>
+        </w:rPr>
+      </w:r>
+      <w:r>
+        <w:rPr>
+          <w:rFonts w:ascii="Georgia" w:hAnsi="Georgia" w:cs="Georgia"/>
+          <w:b/>
+          <w:sz w:val="24"/>
+        </w:rPr>
+        <w:t>QUICK-REFERENCE</w:t>
       </w:r>
     </w:p>
     <w:p>
@@ -7409,67 +7432,102 @@
           <w:i/>
           <w:sz w:val="24"/>
         </w:rPr>
-        <w:t>Hedge Types</w:t>
+      </w:r>
+      <w:r>
+        <w:rPr>
+          <w:rFonts w:ascii="Georgia" w:hAnsi="Georgia" w:cs="Georgia"/>
+          <w:b w:val="0"/>
+          <w:sz w:val="22"/>
+        </w:rPr>
+        <w:t>Coding is context-sensitive. A word is a hedge only when it functions as one in the sentence, not because it appears on a list.</w:t>
       </w:r>
     </w:p>
     <w:p>
       <w:pPr>
         <w:spacing w:line="480" w:lineRule="auto" w:before="0" w:after="0"/>
-        <w:jc w:val="both"/>
-      </w:pPr>
-      <w:r>
-        <w:rPr>
-          <w:rFonts w:ascii="Georgia" w:hAnsi="Georgia" w:eastAsia="Georgia"/>
-          <w:b w:val="0"/>
-          <w:i w:val="0"/>
-          <w:sz w:val="22"/>
-        </w:rPr>
-        <w:t>1. Modal Verbs: may, might, could, would, should, can</w:t>
+        <w:jc w:val="left"/>
+      </w:pPr>
+      <w:r>
+        <w:rPr>
+          <w:rFonts w:ascii="Georgia" w:hAnsi="Georgia" w:eastAsia="Georgia"/>
+          <w:b w:val="0"/>
+          <w:i w:val="0"/>
+          <w:sz w:val="22"/>
+        </w:rPr>
+      </w:r>
+      <w:r>
+        <w:rPr>
+          <w:rFonts w:ascii="Georgia" w:hAnsi="Georgia" w:cs="Georgia"/>
+          <w:b/>
+          <w:sz w:val="24"/>
+        </w:rPr>
+        <w:t>Hedge types</w:t>
       </w:r>
     </w:p>
     <w:p>
       <w:pPr>
         <w:spacing w:line="480" w:lineRule="auto" w:before="0" w:after="0"/>
-        <w:jc w:val="both"/>
-      </w:pPr>
-      <w:r>
-        <w:rPr>
-          <w:rFonts w:ascii="Georgia" w:hAnsi="Georgia" w:eastAsia="Georgia"/>
-          <w:b w:val="0"/>
-          <w:i w:val="0"/>
-          <w:sz w:val="22"/>
-        </w:rPr>
-        <w:t>2. Lexical Verbs and Adjectives: suggest, indicate, appear, seem, propose, assume, possible, probable, likely. Other epistemic adjectives (e.g., potential, conceivable, tentative) are also coded as lexical hedges if they qualify the certainty of a claim and pass the working test.</w:t>
+        <w:jc w:val="left"/>
+      </w:pPr>
+      <w:r>
+        <w:rPr>
+          <w:rFonts w:ascii="Georgia" w:hAnsi="Georgia" w:eastAsia="Georgia"/>
+          <w:b w:val="0"/>
+          <w:i w:val="0"/>
+          <w:sz w:val="22"/>
+        </w:rPr>
+      </w:r>
+      <w:r>
+        <w:rPr>
+          <w:rFonts w:ascii="Georgia" w:hAnsi="Georgia" w:cs="Georgia"/>
+          <w:b w:val="0"/>
+          <w:sz w:val="22"/>
+        </w:rPr>
+        <w:t>1. Modal verbs: may, might, could, would, should, can (when they mark possibility, not capability or obligation).</w:t>
       </w:r>
     </w:p>
     <w:p>
       <w:pPr>
         <w:spacing w:line="480" w:lineRule="auto" w:before="0" w:after="0"/>
-        <w:jc w:val="both"/>
-      </w:pPr>
-      <w:r>
-        <w:rPr>
-          <w:rFonts w:ascii="Georgia" w:hAnsi="Georgia" w:eastAsia="Georgia"/>
-          <w:b w:val="0"/>
-          <w:i w:val="0"/>
-          <w:sz w:val="22"/>
-        </w:rPr>
-        <w:t>3. Adverbial Hedges: generally, typically, possibly, probably, relatively, essentially</w:t>
+        <w:jc w:val="left"/>
+      </w:pPr>
+      <w:r>
+        <w:rPr>
+          <w:rFonts w:ascii="Georgia" w:hAnsi="Georgia" w:eastAsia="Georgia"/>
+          <w:b w:val="0"/>
+          <w:i w:val="0"/>
+          <w:sz w:val="22"/>
+        </w:rPr>
+      </w:r>
+      <w:r>
+        <w:rPr>
+          <w:rFonts w:ascii="Georgia" w:hAnsi="Georgia" w:cs="Georgia"/>
+          <w:b w:val="0"/>
+          <w:sz w:val="22"/>
+        </w:rPr>
+        <w:t>2. Lexical hedges: suggest, indicate, appear, seem, propose, assume, possible, probable, likely, potential (and similar epistemic adjectives or nouns) when they qualify the certainty of a claim and pass the Working Test.</w:t>
       </w:r>
     </w:p>
     <w:p>
       <w:pPr>
         <w:spacing w:line="480" w:lineRule="auto" w:before="0" w:after="0"/>
-        <w:jc w:val="both"/>
-      </w:pPr>
-      <w:r>
-        <w:rPr>
-          <w:rFonts w:ascii="Georgia" w:hAnsi="Georgia" w:eastAsia="Georgia"/>
-          <w:b w:val="0"/>
-          <w:i w:val="0"/>
-          <w:sz w:val="22"/>
-        </w:rPr>
-        <w:t>4. Clause-Level Hedges: it seems that, it is possible that, to some extent, in our view</w:t>
+        <w:jc w:val="left"/>
+      </w:pPr>
+      <w:r>
+        <w:rPr>
+          <w:rFonts w:ascii="Georgia" w:hAnsi="Georgia" w:eastAsia="Georgia"/>
+          <w:b w:val="0"/>
+          <w:i w:val="0"/>
+          <w:sz w:val="22"/>
+        </w:rPr>
+      </w:r>
+      <w:r>
+        <w:rPr>
+          <w:rFonts w:ascii="Georgia" w:hAnsi="Georgia" w:cs="Georgia"/>
+          <w:b w:val="0"/>
+          <w:sz w:val="22"/>
+        </w:rPr>
+        <w:t>3. Adverbial hedges: generally, typically, possibly, probably, relatively, essentially (when they qualify scope or certainty, not procedural routine).</w:t>
       </w:r>
     </w:p>
     <w:p>
@@ -7486,14 +7544,21 @@
           <w:i/>
           <w:sz w:val="24"/>
         </w:rPr>
-        <w:t>Hedge Functions</w:t>
+      </w:r>
+      <w:r>
+        <w:rPr>
+          <w:rFonts w:ascii="Georgia" w:hAnsi="Georgia" w:cs="Georgia"/>
+          <w:b w:val="0"/>
+          <w:sz w:val="22"/>
+        </w:rPr>
+        <w:t>4. Clause-level hedges: it seems that, it is possible that, to some extent, in our view.</w:t>
       </w:r>
     </w:p>
     <w:p>
       <w:pPr>
         <w:spacing w:line="480" w:lineRule="auto" w:before="0" w:after="0"/>
         <w:ind w:firstLine="720"/>
-        <w:jc w:val="both"/>
+        <w:jc w:val="left"/>
       </w:pPr>
       <w:r>
         <w:rPr>
@@ -7502,23 +7567,29 @@
           <w:i w:val="0"/>
           <w:sz w:val="22"/>
         </w:rPr>
-        <w:t xml:space="preserve">Epistemic Caution: </w:t>
-      </w:r>
-      <w:r>
-        <w:rPr>
-          <w:rFonts w:ascii="Georgia" w:hAnsi="Georgia" w:eastAsia="Georgia"/>
-          <w:b w:val="0"/>
-          <w:i w:val="0"/>
-          <w:sz w:val="22"/>
-        </w:rPr>
-        <w:t>Expresses uncertainty about the truth or accuracy of a claim (e.g., The treatment may reduce infection rates).</w:t>
+      </w:r>
+      <w:r>
+        <w:rPr>
+          <w:rFonts w:ascii="Georgia" w:hAnsi="Georgia" w:eastAsia="Georgia"/>
+          <w:b w:val="0"/>
+          <w:i w:val="0"/>
+          <w:sz w:val="22"/>
+        </w:rPr>
+      </w:r>
+      <w:r>
+        <w:rPr>
+          <w:rFonts w:ascii="Georgia" w:hAnsi="Georgia" w:cs="Georgia"/>
+          <w:b/>
+          <w:sz w:val="24"/>
+        </w:rPr>
+        <w:t>Hedge functions</w:t>
       </w:r>
     </w:p>
     <w:p>
       <w:pPr>
         <w:spacing w:line="480" w:lineRule="auto" w:before="0" w:after="0"/>
         <w:ind w:firstLine="720"/>
-        <w:jc w:val="both"/>
+        <w:jc w:val="left"/>
       </w:pPr>
       <w:r>
         <w:rPr>
@@ -7527,23 +7598,29 @@
           <w:i w:val="0"/>
           <w:sz w:val="22"/>
         </w:rPr>
-        <w:t xml:space="preserve">Politeness/Deference: </w:t>
-      </w:r>
-      <w:r>
-        <w:rPr>
-          <w:rFonts w:ascii="Georgia" w:hAnsi="Georgia" w:eastAsia="Georgia"/>
-          <w:b w:val="0"/>
-          <w:i w:val="0"/>
-          <w:sz w:val="22"/>
-        </w:rPr>
-        <w:t>Shows respect toward readers or prior research rather than expressing genuine epistemic uncertainty (e.g., As suggested by Hyland (1998)...).</w:t>
+      </w:r>
+      <w:r>
+        <w:rPr>
+          <w:rFonts w:ascii="Georgia" w:hAnsi="Georgia" w:eastAsia="Georgia"/>
+          <w:b w:val="0"/>
+          <w:i w:val="0"/>
+          <w:sz w:val="22"/>
+        </w:rPr>
+      </w:r>
+      <w:r>
+        <w:rPr>
+          <w:rFonts w:ascii="Georgia" w:hAnsi="Georgia" w:cs="Georgia"/>
+          <w:b w:val="0"/>
+          <w:sz w:val="22"/>
+        </w:rPr>
+        <w:t>Epistemic Caution: marks uncertainty about whether a claim is true (e.g., The treatment may reduce infection rates).</w:t>
       </w:r>
     </w:p>
     <w:p>
       <w:pPr>
         <w:spacing w:line="480" w:lineRule="auto" w:before="0" w:after="0"/>
         <w:ind w:firstLine="720"/>
-        <w:jc w:val="both"/>
+        <w:jc w:val="left"/>
       </w:pPr>
       <w:r>
         <w:rPr>
@@ -7552,16 +7629,22 @@
           <w:i w:val="0"/>
           <w:sz w:val="22"/>
         </w:rPr>
-        <w:t xml:space="preserve">Discourse Organization: </w:t>
-      </w:r>
-      <w:r>
-        <w:rPr>
-          <w:rFonts w:ascii="Georgia" w:hAnsi="Georgia" w:eastAsia="Georgia"/>
-          <w:b w:val="0"/>
-          <w:i w:val="0"/>
-          <w:sz w:val="22"/>
-        </w:rPr>
-        <w:t>Manages text structure or guides reader expectations rather than expressing the writer’s epistemic stance (e.g., It should be noted that...).</w:t>
+      </w:r>
+      <w:r>
+        <w:rPr>
+          <w:rFonts w:ascii="Georgia" w:hAnsi="Georgia" w:eastAsia="Georgia"/>
+          <w:b w:val="0"/>
+          <w:i w:val="0"/>
+          <w:sz w:val="22"/>
+        </w:rPr>
+      </w:r>
+      <w:r>
+        <w:rPr>
+          <w:rFonts w:ascii="Georgia" w:hAnsi="Georgia" w:cs="Georgia"/>
+          <w:b w:val="0"/>
+          <w:sz w:val="22"/>
+        </w:rPr>
+        <w:t>Politeness / Deference: softens face threat or shows respect rather than genuine doubt (e.g., As suggested by Hyland…).</w:t>
       </w:r>
     </w:p>
     <w:p>
@@ -7578,14 +7661,21 @@
           <w:i/>
           <w:sz w:val="24"/>
         </w:rPr>
-        <w:t>Decision Rules for Ambiguous Cases</w:t>
+      </w:r>
+      <w:r>
+        <w:rPr>
+          <w:rFonts w:ascii="Georgia" w:hAnsi="Georgia" w:cs="Georgia"/>
+          <w:b w:val="0"/>
+          <w:sz w:val="22"/>
+        </w:rPr>
+        <w:t>Discourse Organization: manages text structure or reader expectations rather than stance (e.g., It should be noted that…).</w:t>
       </w:r>
     </w:p>
     <w:p>
       <w:pPr>
         <w:spacing w:line="480" w:lineRule="auto" w:before="0" w:after="0"/>
         <w:ind w:firstLine="720"/>
-        <w:jc w:val="both"/>
+        <w:jc w:val="left"/>
       </w:pPr>
       <w:r>
         <w:rPr>
@@ -7594,23 +7684,29 @@
           <w:i w:val="0"/>
           <w:sz w:val="22"/>
         </w:rPr>
-        <w:t xml:space="preserve">• Suggest / Indicate: </w:t>
-      </w:r>
-      <w:r>
-        <w:rPr>
-          <w:rFonts w:ascii="Georgia" w:hAnsi="Georgia" w:eastAsia="Georgia"/>
-          <w:b w:val="0"/>
-          <w:i w:val="0"/>
-          <w:sz w:val="22"/>
-        </w:rPr>
-        <w:t>Coded as Hedge if introducing a finding or result (e.g., Data suggests a significant correlation). NOT coded as a hedge if introducing a recommendation (e.g., We suggest further research).</w:t>
+      </w:r>
+      <w:r>
+        <w:rPr>
+          <w:rFonts w:ascii="Georgia" w:hAnsi="Georgia" w:eastAsia="Georgia"/>
+          <w:b w:val="0"/>
+          <w:i w:val="0"/>
+          <w:sz w:val="22"/>
+        </w:rPr>
+      </w:r>
+      <w:r>
+        <w:rPr>
+          <w:rFonts w:ascii="Georgia" w:hAnsi="Georgia" w:cs="Georgia"/>
+          <w:b/>
+          <w:sz w:val="24"/>
+        </w:rPr>
+        <w:t>Core decision rules</w:t>
       </w:r>
     </w:p>
     <w:p>
       <w:pPr>
         <w:spacing w:line="480" w:lineRule="auto" w:before="0" w:after="0"/>
         <w:ind w:firstLine="720"/>
-        <w:jc w:val="both"/>
+        <w:jc w:val="left"/>
       </w:pPr>
       <w:r>
         <w:rPr>
@@ -7619,23 +7715,29 @@
           <w:i w:val="0"/>
           <w:sz w:val="22"/>
         </w:rPr>
-        <w:t xml:space="preserve">• Can / May: </w:t>
-      </w:r>
-      <w:r>
-        <w:rPr>
-          <w:rFonts w:ascii="Georgia" w:hAnsi="Georgia" w:eastAsia="Georgia"/>
-          <w:b w:val="0"/>
-          <w:i w:val="0"/>
-          <w:sz w:val="22"/>
-        </w:rPr>
-        <w:t>Coded as Hedge if expressing possibility or uncertainty (e.g., This may indicate disease resistance). NOT coded if expressing capability (e.g., PCR can detect low concentrations).</w:t>
+      </w:r>
+      <w:r>
+        <w:rPr>
+          <w:rFonts w:ascii="Georgia" w:hAnsi="Georgia" w:eastAsia="Georgia"/>
+          <w:b w:val="0"/>
+          <w:i w:val="0"/>
+          <w:sz w:val="22"/>
+        </w:rPr>
+      </w:r>
+      <w:r>
+        <w:rPr>
+          <w:rFonts w:ascii="Georgia" w:hAnsi="Georgia" w:cs="Georgia"/>
+          <w:b w:val="0"/>
+          <w:sz w:val="22"/>
+        </w:rPr>
+        <w:t>suggest / indicate → hedge when introducing a finding; not a hedge when introducing a recommendation.</w:t>
       </w:r>
     </w:p>
     <w:p>
       <w:pPr>
         <w:spacing w:line="480" w:lineRule="auto" w:before="0" w:after="0"/>
         <w:ind w:firstLine="720"/>
-        <w:jc w:val="both"/>
+        <w:jc w:val="left"/>
       </w:pPr>
       <w:r>
         <w:rPr>
@@ -7644,23 +7746,29 @@
           <w:i w:val="0"/>
           <w:sz w:val="22"/>
         </w:rPr>
-        <w:t xml:space="preserve">• Generally / Typically: </w:t>
-      </w:r>
-      <w:r>
-        <w:rPr>
-          <w:rFonts w:ascii="Georgia" w:hAnsi="Georgia" w:eastAsia="Georgia"/>
-          <w:b w:val="0"/>
-          <w:i w:val="0"/>
-          <w:sz w:val="22"/>
-        </w:rPr>
-        <w:t>Coded as Hedge if qualifying the scope of a claim (e.g., Plants generally respond to drought by...). NOT coded if describing a procedural norm (e.g., Samples were generally stored at 4°C).</w:t>
+      </w:r>
+      <w:r>
+        <w:rPr>
+          <w:rFonts w:ascii="Georgia" w:hAnsi="Georgia" w:eastAsia="Georgia"/>
+          <w:b w:val="0"/>
+          <w:i w:val="0"/>
+          <w:sz w:val="22"/>
+        </w:rPr>
+      </w:r>
+      <w:r>
+        <w:rPr>
+          <w:rFonts w:ascii="Georgia" w:hAnsi="Georgia" w:cs="Georgia"/>
+          <w:b w:val="0"/>
+          <w:sz w:val="22"/>
+        </w:rPr>
+        <w:t>can / may → hedge when marking possibility; not a hedge when marking capability.</w:t>
       </w:r>
     </w:p>
     <w:p>
       <w:pPr>
         <w:spacing w:line="480" w:lineRule="auto" w:before="0" w:after="0"/>
         <w:ind w:firstLine="720"/>
-        <w:jc w:val="both"/>
+        <w:jc w:val="left"/>
       </w:pPr>
       <w:r>
         <w:rPr>
@@ -7669,16 +7777,22 @@
           <w:i w:val="0"/>
           <w:sz w:val="22"/>
         </w:rPr>
-        <w:t xml:space="preserve">• Appear / Seem: </w:t>
-      </w:r>
-      <w:r>
-        <w:rPr>
-          <w:rFonts w:ascii="Georgia" w:hAnsi="Georgia" w:eastAsia="Georgia"/>
-          <w:b w:val="0"/>
-          <w:i w:val="0"/>
-          <w:sz w:val="22"/>
-        </w:rPr>
-        <w:t>Coded as Hedge if expressing uncertainty about a result (e.g., The pathogen appears to be host-specific). NOT coded if indicating physical or textual location (e.g., The results appear in Table 1).</w:t>
+      </w:r>
+      <w:r>
+        <w:rPr>
+          <w:rFonts w:ascii="Georgia" w:hAnsi="Georgia" w:eastAsia="Georgia"/>
+          <w:b w:val="0"/>
+          <w:i w:val="0"/>
+          <w:sz w:val="22"/>
+        </w:rPr>
+      </w:r>
+      <w:r>
+        <w:rPr>
+          <w:rFonts w:ascii="Georgia" w:hAnsi="Georgia" w:cs="Georgia"/>
+          <w:b w:val="0"/>
+          <w:sz w:val="22"/>
+        </w:rPr>
+        <w:t>generally / typically → hedge when limiting the scope of a claim; not a hedge when describing a procedural norm.</w:t>
       </w:r>
     </w:p>
     <w:p>
@@ -7695,36 +7809,81 @@
           <w:i/>
           <w:sz w:val="24"/>
         </w:rPr>
-        <w:t>Exclusion Rules</w:t>
+      </w:r>
+      <w:r>
+        <w:rPr>
+          <w:rFonts w:ascii="Georgia" w:hAnsi="Georgia" w:cs="Georgia"/>
+          <w:b w:val="0"/>
+          <w:sz w:val="22"/>
+        </w:rPr>
+        <w:t>appear / seem → hedge when expressing uncertainty about a result; not a hedge when pointing to location in a table or text.</w:t>
       </w:r>
     </w:p>
     <w:p>
       <w:pPr>
         <w:spacing w:line="480" w:lineRule="auto" w:before="0" w:after="0"/>
         <w:ind w:firstLine="720"/>
-        <w:jc w:val="both"/>
-      </w:pPr>
-      <w:r>
-        <w:rPr>
-          <w:rFonts w:ascii="Georgia" w:hAnsi="Georgia" w:eastAsia="Georgia"/>
-          <w:b w:val="0"/>
-          <w:i w:val="0"/>
-          <w:sz w:val="22"/>
-        </w:rPr>
-        <w:t>Words expressing ability (can = the method is capable of), future procedure (will = the study will do X), or necessity (must, should in procedural contexts) are not coded as hedges. Working test: if removing the device does not change the epistemic weight of the claim, it is not functioning as a hedge.</w:t>
+        <w:jc w:val="left"/>
+      </w:pPr>
+      <w:r>
+        <w:rPr>
+          <w:rFonts w:ascii="Georgia" w:hAnsi="Georgia" w:eastAsia="Georgia"/>
+          <w:b w:val="0"/>
+          <w:i w:val="0"/>
+          <w:sz w:val="22"/>
+        </w:rPr>
+      </w:r>
+      <w:r>
+        <w:rPr>
+          <w:rFonts w:ascii="Georgia" w:hAnsi="Georgia" w:cs="Georgia"/>
+          <w:b/>
+          <w:sz w:val="24"/>
+        </w:rPr>
+        <w:t>Exclusion and Working Test</w:t>
       </w:r>
     </w:p>
     <w:p>
       <w:pPr>
         <w:spacing w:before="0" w:after="0" w:line="240" w:lineRule="auto"/>
-      </w:pPr>
-      <w:r>
-        <w:rPr>
-          <w:rFonts w:ascii="Georgia" w:hAnsi="Georgia" w:eastAsia="Georgia"/>
-          <w:b w:val="0"/>
-          <w:i w:val="0"/>
-          <w:sz w:val="22"/>
-        </w:rPr>
+        <w:jc w:val="left"/>
+      </w:pPr>
+      <w:r>
+        <w:rPr>
+          <w:rFonts w:ascii="Georgia" w:hAnsi="Georgia" w:eastAsia="Georgia"/>
+          <w:b w:val="0"/>
+          <w:i w:val="0"/>
+          <w:sz w:val="22"/>
+        </w:rPr>
+      </w:r>
+      <w:r>
+        <w:rPr>
+          <w:rFonts w:ascii="Georgia" w:hAnsi="Georgia" w:cs="Georgia"/>
+          <w:b w:val="0"/>
+          <w:sz w:val="22"/>
+        </w:rPr>
+        <w:t>Ability, future procedure, and necessity (must / should in procedural contexts) are never hedges. Working Test: if removing the device does not change how certain or tentative the claim is, it is not a hedge.</w:t>
+      </w:r>
+    </w:p>
+    <w:p>
+      <w:pPr>
+        <w:spacing w:before="0" w:after="0" w:line="480" w:lineRule="auto"/>
+        <w:jc w:val="left"/>
+      </w:pPr>
+      <w:r>
+        <w:rPr>
+          <w:rFonts w:ascii="Georgia" w:hAnsi="Georgia" w:eastAsia="Georgia"/>
+          <w:b/>
+          <w:i w:val="0"/>
+          <w:sz w:val="28"/>
+        </w:rPr>
+      </w:r>
+      <w:r>
+        <w:rPr>
+          <w:rFonts w:ascii="Georgia" w:hAnsi="Georgia" w:cs="Georgia"/>
+          <w:b/>
+          <w:sz w:val="24"/>
+        </w:rPr>
+        <w:t>FULL CODEBOOK</w:t>
       </w:r>
     </w:p>
     <w:p>
@@ -7738,64 +7897,6 @@
           <w:i w:val="0"/>
           <w:sz w:val="22"/>
         </w:rPr>
-      </w:r>
-    </w:p>
-    <w:p>
-      <w:pPr>
-        <w:spacing w:before="0" w:after="0" w:line="240" w:lineRule="auto"/>
-      </w:pPr>
-      <w:r>
-        <w:rPr>
-          <w:rFonts w:ascii="Georgia" w:hAnsi="Georgia" w:eastAsia="Georgia"/>
-          <w:b w:val="0"/>
-          <w:i w:val="0"/>
-          <w:sz w:val="22"/>
-        </w:rPr>
-      </w:r>
-    </w:p>
-    <w:p>
-      <w:pPr>
-        <w:pageBreakBefore/>
-        <w:spacing w:before="0" w:after="0" w:line="480" w:lineRule="auto"/>
-        <w:jc w:val="center"/>
-      </w:pPr>
-      <w:r>
-        <w:rPr>
-          <w:rFonts w:ascii="Georgia" w:hAnsi="Georgia" w:eastAsia="Georgia"/>
-          <w:b/>
-          <w:i w:val="0"/>
-          <w:sz w:val="28"/>
-        </w:rPr>
-        <w:t>APPENDIX B: PILOT SAMPLE ANALYSIS AND CODING VERIFICATION</w:t>
-      </w:r>
-    </w:p>
-    <w:p>
-      <w:pPr>
-        <w:spacing w:before="0" w:after="0" w:line="240" w:lineRule="auto"/>
-      </w:pPr>
-      <w:r>
-        <w:rPr>
-          <w:rFonts w:ascii="Georgia" w:hAnsi="Georgia" w:eastAsia="Georgia"/>
-          <w:b w:val="0"/>
-          <w:i w:val="0"/>
-          <w:sz w:val="22"/>
-        </w:rPr>
-      </w:r>
-    </w:p>
-    <w:p>
-      <w:pPr>
-        <w:spacing w:line="480" w:lineRule="auto" w:before="0" w:after="0"/>
-        <w:ind w:firstLine="720"/>
-        <w:jc w:val="both"/>
-      </w:pPr>
-      <w:r>
-        <w:rPr>
-          <w:rFonts w:ascii="Georgia" w:hAnsi="Georgia" w:eastAsia="Georgia"/>
-          <w:b w:val="0"/>
-          <w:i w:val="0"/>
-          <w:sz w:val="22"/>
-        </w:rPr>
-        <w:t>This appendix presents the coding results of four abstracts analyzed during the pilot testing phase. Each abstract is presented followed by its coding summary to demonstrate the application of the coding key and decision rules.</w:t>
       </w:r>
     </w:p>
     <w:p>
@@ -7807,595 +7908,35 @@
       </w:pPr>
       <w:r>
         <w:rPr>
-          <w:rFonts w:ascii="Georgia" w:hAnsi="Georgia" w:eastAsia="Georgia"/>
-          <w:b w:val="0"/>
-          <w:i/>
-          <w:sz w:val="24"/>
-        </w:rPr>
-        <w:t>Sample 1: Biology</w:t>
+          <w:rFonts w:ascii="Georgia" w:hAnsi="Georgia" w:eastAsia="Georgia" w:cs="Georgia"/>
+          <w:b/>
+          <w:i w:val="0"/>
+          <w:sz w:val="22"/>
+        </w:rPr>
+        <w:t>PURPOSE</w:t>
       </w:r>
     </w:p>
     <w:p>
       <w:pPr>
         <w:spacing w:line="480" w:lineRule="auto" w:before="0" w:after="0"/>
         <w:ind w:firstLine="720"/>
-        <w:jc w:val="both"/>
-      </w:pPr>
-      <w:r>
-        <w:rPr>
-          <w:rFonts w:ascii="Georgia" w:hAnsi="Georgia" w:eastAsia="Georgia"/>
-          <w:b w:val="0"/>
-          <w:i w:val="0"/>
-          <w:sz w:val="22"/>
-        </w:rPr>
-        <w:t>A field and laboratory monitoring was conducted at the Bureau of Fisheries and Aquatic Resources Regional Fish Health Laboratory 3 (BFAR RFHL3) and Zambales, Philippines to compare the effectiveness of Nested Polymerase Chain Reaction and Micro-Insulated Isothermal PCR (Pocket) in monitoring Acute Hepatopancreatic Necrosis Disease.</w:t>
-      </w:r>
-    </w:p>
-    <w:p>
-      <w:pPr>
-        <w:spacing w:line="480" w:lineRule="auto" w:before="0" w:after="0"/>
-        <w:ind w:firstLine="720"/>
-        <w:jc w:val="both"/>
-      </w:pPr>
-      <w:r>
-        <w:rPr>
-          <w:rFonts w:ascii="Georgia" w:hAnsi="Georgia" w:eastAsia="Georgia"/>
-          <w:b w:val="0"/>
-          <w:i w:val="0"/>
-          <w:sz w:val="22"/>
-        </w:rPr>
-        <w:t>A total of 33 samples were used in this study to compare the results of Nested Polymerase Chain Reaction and Micro-Insulated Isothermal Polymerase Chain Reaction (POCKIT) in monitoring Acute Hepatopancreatic Necrosis Disease-causing Vibrio parahaemolyticus. The study used collected shrimp samples, pre-detected samples, and positive and negative standards for the detection of Acute Hepatopancreatic Necrosis Disease-causing Vibrio parahaemolyticus on shrimp samples; bacterial culture for vibrio sp. was also conducted as well as dna sequencing for the confirmation of the results. The result showed negative results on all the shrimp samples that led to the conclusion that all shrimp farms were free from Acute Hepatopancreatic Necrosis Disease-causing Vibrio parahaemolyticus.</w:t>
-      </w:r>
-    </w:p>
-    <w:p>
-      <w:pPr>
-        <w:spacing w:line="480" w:lineRule="auto" w:before="0" w:after="0"/>
-        <w:ind w:firstLine="720"/>
-        <w:jc w:val="both"/>
-      </w:pPr>
-      <w:r>
-        <w:rPr>
-          <w:rFonts w:ascii="Georgia" w:hAnsi="Georgia" w:eastAsia="Georgia"/>
-          <w:b/>
-          <w:i w:val="0"/>
-          <w:sz w:val="22"/>
-        </w:rPr>
-        <w:t>Hedge Count: 0</w:t>
-      </w:r>
-    </w:p>
-    <w:p>
-      <w:pPr>
-        <w:spacing w:line="480" w:lineRule="auto" w:before="0" w:after="0"/>
-        <w:ind w:firstLine="720"/>
-        <w:jc w:val="both"/>
-      </w:pPr>
-      <w:r>
-        <w:rPr>
-          <w:rFonts w:ascii="Georgia" w:hAnsi="Georgia" w:eastAsia="Georgia"/>
-          <w:b w:val="0"/>
-          <w:i w:val="0"/>
-          <w:sz w:val="22"/>
-        </w:rPr>
-        <w:t>Analysis: The abstract relies entirely on factive verbs (conducted, showed, led to the conclusion). The final claim is presented as categorical with no qualification.</w:t>
-      </w:r>
-    </w:p>
-    <w:p>
-      <w:pPr>
-        <w:spacing w:line="480" w:lineRule="auto" w:before="0" w:after="0"/>
-        <w:ind w:firstLine="720"/>
-        <w:jc w:val="both"/>
-      </w:pPr>
-      <w:r>
-        <w:rPr>
-          <w:rFonts w:ascii="Georgia" w:hAnsi="Georgia" w:eastAsia="Georgia"/>
-          <w:b/>
-          <w:i w:val="0"/>
-          <w:sz w:val="22"/>
-        </w:rPr>
-        <w:t xml:space="preserve">Key Excerpt: </w:t>
-      </w:r>
-      <w:r>
-        <w:rPr>
-          <w:rFonts w:ascii="Georgia" w:hAnsi="Georgia" w:eastAsia="Georgia"/>
-          <w:b w:val="0"/>
-          <w:i w:val="0"/>
-          <w:sz w:val="22"/>
-        </w:rPr>
-        <w:t>“The result showed negative results that led to the conclusion that all shrimp farms were free…”</w:t>
-      </w:r>
-    </w:p>
-    <w:p>
-      <w:pPr>
-        <w:keepNext/>
-        <w:keepLines/>
-        <w:spacing w:before="240" w:after="240" w:line="480" w:lineRule="auto"/>
         <w:jc w:val="left"/>
       </w:pPr>
       <w:r>
         <w:rPr>
           <w:rFonts w:ascii="Georgia" w:hAnsi="Georgia" w:eastAsia="Georgia"/>
           <w:b w:val="0"/>
-          <w:i/>
-          <w:sz w:val="24"/>
-        </w:rPr>
-        <w:t>Sample 2: Veterinary Medicine</w:t>
-      </w:r>
-    </w:p>
-    <w:p>
-      <w:pPr>
-        <w:spacing w:line="480" w:lineRule="auto" w:before="0" w:after="0"/>
-        <w:ind w:firstLine="720"/>
-        <w:jc w:val="both"/>
-      </w:pPr>
-      <w:r>
-        <w:rPr>
-          <w:rFonts w:ascii="Georgia" w:hAnsi="Georgia" w:eastAsia="Georgia"/>
-          <w:b w:val="0"/>
-          <w:i w:val="0"/>
-          <w:sz w:val="22"/>
-        </w:rPr>
-        <w:t>The study was conducted to determine and compare the staining effect of C. longa, I. batatas and M. acuminata aqueous extracts for gonad examination of Nile tilapia. Twelve Nile tilapia fingerlings, with approximately two and one-half to four-inch size, were divided into four treatments with three replicates each. Treatment 1 was assigned as the positive control, which were stained with malachite green, while Treatments 2, 3 and 4 were stained with C. longa, I. batatas and M. acuminata extracts, respectively. The prepared slides of stained gonads were randomly distributed on the microscopes using completely randomized design (CRD). Blind examination and evaluation by five faculty members was done on the stained unlabeled tissues under the microscopes. The tissues were evaluated according to five parameters: hue, saturation, contrast, clarity and overall appearance. A scoring scheme was followed, i.e. 1 to 2 – very poor; 3 to 4 – poor; 5 to 6 – average; 7 to 8 – good; and 9 to 10 – excellent. Data gathered were subjected to one-way analysis of variance (ANOVA). The results suggested that C. longa, I. batatas and M. acuminata extracts are potential alternative stains for gonadal examination of Nile tilapia with M. acuminata as the most preferred.</w:t>
-      </w:r>
-    </w:p>
-    <w:p>
-      <w:pPr>
-        <w:spacing w:line="480" w:lineRule="auto" w:before="0" w:after="0"/>
-        <w:ind w:firstLine="720"/>
-        <w:jc w:val="both"/>
-      </w:pPr>
-      <w:r>
-        <w:rPr>
-          <w:rFonts w:ascii="Georgia" w:hAnsi="Georgia" w:eastAsia="Georgia"/>
-          <w:b/>
-          <w:i w:val="0"/>
-          <w:sz w:val="22"/>
-        </w:rPr>
-        <w:t>Hedge Count: 2</w:t>
-      </w:r>
-    </w:p>
-    <w:p>
-      <w:pPr>
-        <w:spacing w:line="480" w:lineRule="auto" w:before="0" w:after="0"/>
-        <w:ind w:firstLine="720"/>
-        <w:jc w:val="both"/>
-      </w:pPr>
-      <w:r>
-        <w:rPr>
-          <w:rFonts w:ascii="Georgia" w:hAnsi="Georgia" w:eastAsia="Georgia"/>
-          <w:b w:val="0"/>
-          <w:i w:val="0"/>
-          <w:sz w:val="22"/>
-        </w:rPr>
-        <w:t>Analysis: This abstract demonstrates awareness of claim management. Both hedges serve to qualify the final conclusion.</w:t>
-      </w:r>
-    </w:p>
-    <w:p>
-      <w:pPr>
-        <w:spacing w:line="480" w:lineRule="auto" w:before="0" w:after="0"/>
-        <w:ind w:firstLine="720"/>
-        <w:jc w:val="both"/>
-      </w:pPr>
-      <w:r>
-        <w:rPr>
-          <w:rFonts w:ascii="Georgia" w:hAnsi="Georgia" w:eastAsia="Georgia"/>
-          <w:b/>
-          <w:i w:val="0"/>
-          <w:sz w:val="22"/>
-        </w:rPr>
-        <w:t>Coded Instances:</w:t>
-      </w:r>
-    </w:p>
-    <w:p>
-      <w:pPr>
-        <w:spacing w:line="480" w:lineRule="auto" w:before="0" w:after="0"/>
-        <w:jc w:val="both"/>
-      </w:pPr>
-      <w:r>
-        <w:rPr>
-          <w:rFonts w:ascii="Georgia" w:hAnsi="Georgia" w:eastAsia="Georgia"/>
-          <w:b w:val="0"/>
-          <w:i w:val="0"/>
-          <w:sz w:val="22"/>
-        </w:rPr>
-        <w:t>“The results suggested that...” (Lexical Verb - Epistemic Caution)</w:t>
-      </w:r>
-    </w:p>
-    <w:p>
-      <w:pPr>
-        <w:spacing w:line="480" w:lineRule="auto" w:before="0" w:after="0"/>
-        <w:jc w:val="both"/>
-      </w:pPr>
-      <w:r>
-        <w:rPr>
-          <w:rFonts w:ascii="Georgia" w:hAnsi="Georgia" w:eastAsia="Georgia"/>
-          <w:b w:val="0"/>
-          <w:i w:val="0"/>
-          <w:sz w:val="22"/>
-        </w:rPr>
-        <w:t>“...extracts are potential alternative stains...” (Lexical Adjective - Epistemic Caution)</w:t>
-      </w:r>
-    </w:p>
-    <w:p>
-      <w:pPr>
-        <w:spacing w:line="480" w:lineRule="auto" w:before="0" w:after="0"/>
-        <w:ind w:firstLine="720"/>
-        <w:jc w:val="both"/>
-      </w:pPr>
-      <w:r>
-        <w:rPr>
-          <w:rFonts w:ascii="Georgia" w:hAnsi="Georgia" w:eastAsia="Georgia"/>
-          <w:b/>
-          <w:i w:val="0"/>
-          <w:sz w:val="22"/>
-        </w:rPr>
-        <w:t xml:space="preserve">Excluded: </w:t>
-      </w:r>
-      <w:r>
-        <w:rPr>
-          <w:rFonts w:ascii="Georgia" w:hAnsi="Georgia" w:eastAsia="Georgia"/>
-          <w:b w:val="0"/>
-          <w:i w:val="0"/>
-          <w:sz w:val="22"/>
-        </w:rPr>
-        <w:t>“approximately two and one-half” (Procedural measurement, not epistemic).</w:t>
-      </w:r>
-    </w:p>
-    <w:p>
-      <w:pPr>
-        <w:keepNext/>
-        <w:keepLines/>
-        <w:spacing w:before="240" w:after="240" w:line="480" w:lineRule="auto"/>
-        <w:jc w:val="left"/>
-      </w:pPr>
-      <w:r>
-        <w:rPr>
-          <w:rFonts w:ascii="Georgia" w:hAnsi="Georgia" w:eastAsia="Georgia"/>
-          <w:b w:val="0"/>
-          <w:i/>
-          <w:sz w:val="24"/>
-        </w:rPr>
-        <w:t>Sample 3: Agriculture (Animal Science)</w:t>
-      </w:r>
-    </w:p>
-    <w:p>
-      <w:pPr>
-        <w:spacing w:line="480" w:lineRule="auto" w:before="0" w:after="0"/>
-        <w:ind w:firstLine="720"/>
-        <w:jc w:val="both"/>
-      </w:pPr>
-      <w:r>
-        <w:rPr>
-          <w:rFonts w:ascii="Georgia" w:hAnsi="Georgia" w:eastAsia="Georgia"/>
-          <w:b w:val="0"/>
-          <w:i w:val="0"/>
-          <w:sz w:val="22"/>
-        </w:rPr>
-        <w:t>The study was conducted for 7 days from July 07 to July 13, 2022 at Brgy. San Roque, Magalang, Pampanga. The general objective of the study was to determine the acceptability and palatability of duck ham subjected to different curing process. Specifically, it aimed to find the sensory evaluation: appearance; aroma; taste/ flavor; texture; and over-all acceptability. A total of eight (8) Muscovy ducks were used in this study. The study used Hedonic Likert Scale and was subjected to Desriptive analysis. Factor A = Type of curing and Factor B = Spice rub. The treatments used in this study are the following. A₁ B₁ - Dry curing + Oregano, A₁ B₂ - Dry curing + Lemon grass, A₂ B₁ - Liquid curing + Oregano and A₁ B₂ - Liquid curing + Lemon grass. The sensory evaluation was conducted at Pampanga State Agricultural University, PAC, Magalang, Pampanga. Ten (10) college students, ten (10) teachers and ten (10) people who don’t eat duck were selected as respondents to evaluate the sample treatments. The data collected from the sensory evaluation were analysed using descriptive statistics.</w:t>
-      </w:r>
-    </w:p>
-    <w:p>
-      <w:pPr>
-        <w:spacing w:line="480" w:lineRule="auto" w:before="0" w:after="0"/>
-        <w:ind w:firstLine="720"/>
-        <w:jc w:val="both"/>
-      </w:pPr>
-      <w:r>
-        <w:rPr>
-          <w:rFonts w:ascii="Georgia" w:hAnsi="Georgia" w:eastAsia="Georgia"/>
-          <w:b w:val="0"/>
-          <w:i w:val="0"/>
-          <w:sz w:val="22"/>
-        </w:rPr>
-        <w:t>Results of the study showed that Comparison on Curing Methods Using Oregano - dry cured duck ham had the highest rating with regards to appearance, texture and overall acceptability. While liquid cure duck ham got the highest rating in terms of aroma and taste/flavor. Comparison on Curing Methods Using Lemon Grass - liquid cured duck ham had the highest rating in terms to appearance, aroma, taste/flavor, texture and overall acceptability. Comparison of Spices on Dry Curing (Smoking) - dry cure duck ham smoked in lemon grass had the highest rating in terms of appearance, aroma, taste/flavor, texture and overall acceptability. Comparison of Spices on Liquid Smoke - liquid cured duck ham smoked in lemon grass had the highest rating in relation to appearance, aroma, taste/flavor, texture and overall acceptability. Descriptive rating revealed that all the treatment with regards to appearance, aroma, taste/flavor, texture and overall acceptability were rated moderately like.</w:t>
-      </w:r>
-    </w:p>
-    <w:p>
-      <w:pPr>
-        <w:spacing w:line="480" w:lineRule="auto" w:before="0" w:after="0"/>
-        <w:ind w:firstLine="720"/>
-        <w:jc w:val="both"/>
-      </w:pPr>
-      <w:r>
-        <w:rPr>
-          <w:rFonts w:ascii="Georgia" w:hAnsi="Georgia" w:eastAsia="Georgia"/>
-          <w:b/>
-          <w:i w:val="0"/>
-          <w:sz w:val="22"/>
-        </w:rPr>
-        <w:t>Hedge Count: 0</w:t>
-      </w:r>
-    </w:p>
-    <w:p>
-      <w:pPr>
-        <w:spacing w:line="480" w:lineRule="auto" w:before="0" w:after="0"/>
-        <w:ind w:firstLine="720"/>
-        <w:jc w:val="both"/>
-      </w:pPr>
-      <w:r>
-        <w:rPr>
-          <w:rFonts w:ascii="Georgia" w:hAnsi="Georgia" w:eastAsia="Georgia"/>
-          <w:b w:val="0"/>
-          <w:i w:val="0"/>
-          <w:sz w:val="22"/>
-        </w:rPr>
-        <w:t>Analysis: The abstract uses factive reporting verbs (showed, revealed). Sensory evaluation ratings are reported as absolute data points. The term “moderately like” describes a Likert scale variable, not an epistemic qualification.</w:t>
-      </w:r>
-    </w:p>
-    <w:p>
-      <w:pPr>
-        <w:spacing w:line="480" w:lineRule="auto" w:before="0" w:after="0"/>
-        <w:ind w:firstLine="720"/>
-        <w:jc w:val="both"/>
-      </w:pPr>
-      <w:r>
-        <w:rPr>
-          <w:rFonts w:ascii="Georgia" w:hAnsi="Georgia" w:eastAsia="Georgia"/>
-          <w:b/>
-          <w:i w:val="0"/>
-          <w:sz w:val="22"/>
-        </w:rPr>
-        <w:t xml:space="preserve">Key Excerpt: </w:t>
-      </w:r>
-      <w:r>
-        <w:rPr>
-          <w:rFonts w:ascii="Georgia" w:hAnsi="Georgia" w:eastAsia="Georgia"/>
-          <w:b w:val="0"/>
-          <w:i w:val="0"/>
-          <w:sz w:val="22"/>
-        </w:rPr>
-        <w:t>“Results of the study showed that Comparison on Curing Methods…”</w:t>
-      </w:r>
-    </w:p>
-    <w:p>
-      <w:pPr>
-        <w:keepNext/>
-        <w:keepLines/>
-        <w:spacing w:before="240" w:after="240" w:line="480" w:lineRule="auto"/>
-        <w:jc w:val="left"/>
-      </w:pPr>
-      <w:r>
-        <w:rPr>
-          <w:rFonts w:ascii="Georgia" w:hAnsi="Georgia" w:eastAsia="Georgia"/>
-          <w:b w:val="0"/>
-          <w:i/>
-          <w:sz w:val="24"/>
-        </w:rPr>
-        <w:t>Sample 4: Agriculture (Crop Science)</w:t>
-      </w:r>
-    </w:p>
-    <w:p>
-      <w:pPr>
-        <w:spacing w:line="480" w:lineRule="auto" w:before="0" w:after="0"/>
-        <w:ind w:firstLine="720"/>
-        <w:jc w:val="both"/>
-      </w:pPr>
-      <w:r>
-        <w:rPr>
-          <w:rFonts w:ascii="Georgia" w:hAnsi="Georgia" w:eastAsia="Georgia"/>
-          <w:b w:val="0"/>
-          <w:i w:val="0"/>
-          <w:sz w:val="22"/>
-        </w:rPr>
-        <w:t>The study was conducted from June to July 2022 to determine the influence of the different sources of nutrients to rice straw mushrooms. The field experiment was conducted in Sitio Pitabacan, San Ildefonso, Magalang, Pampanga. The experiment was laid out using Complete Randomize Design (CRD), with four treatments replicated four times. The treatments were as follows: T₀- Untreated banana leaves substrate submerged in 55 gallon of water (Control); T₁- Banana leaves substrate submerged in mixture of 100 grams of Urea and 55 gallons of water; T₂- Banana leaves substrate submerged in mixture of 250 ml of fish amino acid and 55 gallons of water; and, T₃- Banana leaves substrate submerged in mixture of 250 ml of fermented plant juice and 55 gallons of water.</w:t>
-      </w:r>
-    </w:p>
-    <w:p>
-      <w:pPr>
-        <w:spacing w:line="480" w:lineRule="auto" w:before="0" w:after="0"/>
-        <w:ind w:firstLine="720"/>
-        <w:jc w:val="both"/>
-      </w:pPr>
-      <w:r>
-        <w:rPr>
-          <w:rFonts w:ascii="Georgia" w:hAnsi="Georgia" w:eastAsia="Georgia"/>
-          <w:b w:val="0"/>
-          <w:i w:val="0"/>
-          <w:sz w:val="22"/>
-        </w:rPr>
-        <w:t>Results of the study revealed significant differences in the following parameters: average weight of button harvested, number of buttons harvested, average yield per harvest, and biological efficiency of rice straw mushroom. However, insignificant differences were observed on the days of pinhead appearance and days of harvesting. The highest ROI was obtained in T₁- Banana leaves substrate submerged in a mixture of 100 grams of Urea and 55 gallons of water with every peso of investment 1.01 pesos of net income return.</w:t>
-      </w:r>
-    </w:p>
-    <w:p>
-      <w:pPr>
-        <w:spacing w:line="480" w:lineRule="auto" w:before="0" w:after="0"/>
-        <w:ind w:firstLine="720"/>
-        <w:jc w:val="both"/>
-      </w:pPr>
-      <w:r>
-        <w:rPr>
-          <w:rFonts w:ascii="Georgia" w:hAnsi="Georgia" w:eastAsia="Georgia"/>
-          <w:b/>
-          <w:i w:val="0"/>
-          <w:sz w:val="22"/>
-        </w:rPr>
-        <w:t>Hedge Count: 0</w:t>
-      </w:r>
-    </w:p>
-    <w:p>
-      <w:pPr>
-        <w:spacing w:line="480" w:lineRule="auto" w:before="0" w:after="0"/>
-        <w:ind w:firstLine="720"/>
-        <w:jc w:val="both"/>
-      </w:pPr>
-      <w:r>
-        <w:rPr>
-          <w:rFonts w:ascii="Georgia" w:hAnsi="Georgia" w:eastAsia="Georgia"/>
-          <w:b w:val="0"/>
-          <w:i w:val="0"/>
-          <w:sz w:val="22"/>
-        </w:rPr>
-        <w:t>Analysis: Statistical significance is reported as fact (revealed significant differences). No devices are used to qualify the biological efficiency or yield claims.</w:t>
-      </w:r>
-    </w:p>
-    <w:p>
-      <w:pPr>
-        <w:spacing w:line="480" w:lineRule="auto" w:before="0" w:after="0"/>
-        <w:ind w:firstLine="720"/>
-        <w:jc w:val="both"/>
-      </w:pPr>
-      <w:r>
-        <w:rPr>
-          <w:rFonts w:ascii="Georgia" w:hAnsi="Georgia" w:eastAsia="Georgia"/>
-          <w:b/>
-          <w:i w:val="0"/>
-          <w:sz w:val="22"/>
-        </w:rPr>
-        <w:t xml:space="preserve">Key Excerpt: </w:t>
-      </w:r>
-      <w:r>
-        <w:rPr>
-          <w:rFonts w:ascii="Georgia" w:hAnsi="Georgia" w:eastAsia="Georgia"/>
-          <w:b w:val="0"/>
-          <w:i w:val="0"/>
-          <w:sz w:val="22"/>
-        </w:rPr>
-        <w:t>“Results of the study revealed significant differences... The highest ROI was obtained…”</w:t>
-      </w:r>
-    </w:p>
-    <w:p>
-      <w:pPr>
-        <w:keepNext/>
-        <w:keepLines/>
-        <w:spacing w:before="240" w:after="240" w:line="480" w:lineRule="auto"/>
-        <w:jc w:val="left"/>
-      </w:pPr>
-      <w:r>
-        <w:rPr>
-          <w:rFonts w:ascii="Georgia" w:hAnsi="Georgia" w:eastAsia="Georgia"/>
-          <w:b w:val="0"/>
-          <w:i/>
-          <w:sz w:val="24"/>
-        </w:rPr>
-        <w:t>General Observation from Pilot Testing</w:t>
-      </w:r>
-    </w:p>
-    <w:p>
-      <w:pPr>
-        <w:spacing w:line="480" w:lineRule="auto" w:before="0" w:after="0"/>
-        <w:ind w:firstLine="720"/>
-        <w:jc w:val="both"/>
-      </w:pPr>
-      <w:r>
-        <w:rPr>
-          <w:rFonts w:ascii="Georgia" w:hAnsi="Georgia" w:eastAsia="Georgia"/>
-          <w:b w:val="0"/>
-          <w:i w:val="0"/>
-          <w:sz w:val="22"/>
-        </w:rPr>
-        <w:t>The pilot analysis revealed a high frequency of zero-hedge abstracts (3 out of 4). This pattern suggests that developing researchers may either lack awareness of hedging conventions or interpret the abstract genre as a space for factual reporting rather than claim management. This observation confirms the need for a descriptive baseline study.</w:t>
-      </w:r>
-    </w:p>
-    <w:p>
-      <w:pPr>
-        <w:sectPr>
-          <w:headerReference w:type="default" r:id="rId20"/>
-          <w:headerReference w:type="first" r:id="rId21"/>
-          <w:pgSz w:w="11906" w:h="16838"/>
-          <w:pgMar w:top="1440" w:right="1440" w:bottom="1440" w:left="2160" w:header="720" w:footer="720" w:gutter="0"/>
-          <w:cols w:space="720"/>
-          <w:titlePg/>
-          <w:docGrid w:linePitch="360"/>
-        </w:sectPr>
-      </w:pPr>
-    </w:p>
-    <w:p>
-      <w:pPr>
-        <w:spacing w:before="0" w:after="0" w:line="240" w:lineRule="auto"/>
-      </w:pPr>
-      <w:r>
-        <w:rPr>
-          <w:rFonts w:ascii="Georgia" w:hAnsi="Georgia" w:eastAsia="Georgia"/>
-          <w:b w:val="0"/>
-          <w:i w:val="0"/>
-          <w:sz w:val="22"/>
-        </w:rPr>
-      </w:r>
-    </w:p>
-    <w:p>
-      <w:pPr>
-        <w:spacing w:before="0" w:after="0" w:line="240" w:lineRule="auto"/>
-      </w:pPr>
-      <w:r>
-        <w:rPr>
-          <w:rFonts w:ascii="Georgia" w:hAnsi="Georgia" w:eastAsia="Georgia"/>
-          <w:b w:val="0"/>
-          <w:i w:val="0"/>
-          <w:sz w:val="22"/>
-        </w:rPr>
-      </w:r>
-    </w:p>
-    <w:p>
-      <w:pPr>
-        <w:spacing w:before="0" w:after="0" w:line="240" w:lineRule="auto"/>
-      </w:pPr>
-      <w:r>
-        <w:rPr>
-          <w:rFonts w:ascii="Georgia" w:hAnsi="Georgia" w:eastAsia="Georgia"/>
-          <w:b w:val="0"/>
-          <w:i w:val="0"/>
-          <w:sz w:val="22"/>
-        </w:rPr>
-      </w:r>
-    </w:p>
-    <w:p>
-      <w:pPr>
-        <w:spacing w:before="0" w:after="0" w:line="480" w:lineRule="auto"/>
-        <w:jc w:val="center"/>
-      </w:pPr>
-      <w:r>
-        <w:rPr>
-          <w:rFonts w:ascii="Georgia" w:hAnsi="Georgia" w:eastAsia="Georgia"/>
-          <w:b/>
-          <w:i w:val="0"/>
-          <w:sz w:val="28"/>
-        </w:rPr>
-        <w:t>APPENDIX C: HEDGING CODEBOOK</w:t>
-      </w:r>
-    </w:p>
-    <w:p>
-      <w:pPr>
-        <w:spacing w:before="0" w:after="0" w:line="240" w:lineRule="auto"/>
-      </w:pPr>
-      <w:r>
-        <w:rPr>
-          <w:rFonts w:ascii="Georgia" w:hAnsi="Georgia" w:eastAsia="Georgia"/>
-          <w:b w:val="0"/>
-          <w:i w:val="0"/>
-          <w:sz w:val="22"/>
-        </w:rPr>
-      </w:r>
-    </w:p>
-    <w:p>
-      <w:pPr>
-        <w:keepNext/>
-        <w:keepLines/>
-        <w:spacing w:before="240" w:after="240" w:line="480" w:lineRule="auto"/>
-        <w:jc w:val="left"/>
-      </w:pPr>
-      <w:r>
-        <w:rPr>
-          <w:rFonts w:ascii="Georgia" w:hAnsi="Georgia" w:eastAsia="Georgia"/>
-          <w:b/>
-          <w:i w:val="0"/>
-          <w:sz w:val="24"/>
-        </w:rPr>
-        <w:t>PURPOSE</w:t>
-      </w:r>
-    </w:p>
-    <w:p>
-      <w:pPr>
-        <w:spacing w:line="480" w:lineRule="auto" w:before="0" w:after="0"/>
-        <w:ind w:firstLine="720"/>
-        <w:jc w:val="both"/>
-      </w:pPr>
-      <w:r>
-        <w:rPr>
-          <w:rFonts w:ascii="Georgia" w:hAnsi="Georgia" w:eastAsia="Georgia"/>
-          <w:b w:val="0"/>
-          <w:i w:val="0"/>
-          <w:sz w:val="22"/>
-        </w:rPr>
-        <w:t>This codebook operationalizes Hyland’s (1998) hedging framework for coding the PSAU thesis abstract corpus. All colors are background highlights, applied by hand or digital highlighter directly on printed or PDF copies. They are not font colors and are not tied to any software. The highlighted hard copies are the primary coding record; any spreadsheet is a derived tally, not the source of truth.</w:t>
+          <w:i w:val="0"/>
+          <w:sz w:val="22"/>
+        </w:rPr>
+      </w:r>
+      <w:r>
+        <w:rPr>
+          <w:rFonts w:ascii="Georgia" w:hAnsi="Georgia" w:cs="Georgia"/>
+          <w:b w:val="0"/>
+          <w:sz w:val="22"/>
+        </w:rPr>
+        <w:t>This codebook turns Hyland’s (1998) framework into a practical coding scheme for the PSAU undergraduate thesis abstract corpus. Highlights are background colors applied by hand or digital highlighter on printed or PDF copies. They are not font colors and are not software-dependent. The marked hard copy is the primary record; any spreadsheet is only a derived tally.</w:t>
       </w:r>
     </w:p>
     <w:p>
@@ -13327,17 +12868,629 @@
     </w:p>
     <w:p>
       <w:pPr>
+        <w:pageBreakBefore/>
         <w:spacing w:before="0" w:after="0" w:line="480" w:lineRule="auto"/>
         <w:jc w:val="center"/>
       </w:pPr>
       <w:r>
         <w:rPr>
-          <w:rFonts w:ascii="Georgia" w:hAnsi="Georgia" w:eastAsia="Georgia"/>
+          <w:rFonts w:ascii="Georgia" w:hAnsi="Georgia" w:eastAsia="Georgia" w:cs="Georgia"/>
           <w:b/>
           <w:i w:val="0"/>
           <w:sz w:val="28"/>
         </w:rPr>
-        <w:t>APPENDIX D: CODED CORPUS WITH HIGHLIGHTS</w:t>
+        <w:t>APPENDIX B: PILOT SAMPLE ANALYSIS AND CODING VERIFICATION</w:t>
+      </w:r>
+    </w:p>
+    <w:p>
+      <w:pPr>
+        <w:spacing w:before="0" w:after="0" w:line="240" w:lineRule="auto"/>
+      </w:pPr>
+      <w:r>
+        <w:rPr>
+          <w:rFonts w:ascii="Georgia" w:hAnsi="Georgia" w:eastAsia="Georgia"/>
+          <w:b w:val="0"/>
+          <w:i w:val="0"/>
+          <w:sz w:val="22"/>
+        </w:rPr>
+      </w:r>
+    </w:p>
+    <w:p>
+      <w:pPr>
+        <w:spacing w:line="480" w:lineRule="auto" w:before="0" w:after="0"/>
+        <w:ind w:firstLine="720"/>
+        <w:jc w:val="left"/>
+      </w:pPr>
+      <w:r>
+        <w:rPr>
+          <w:rFonts w:ascii="Georgia" w:hAnsi="Georgia" w:eastAsia="Georgia"/>
+          <w:b w:val="0"/>
+          <w:i w:val="0"/>
+          <w:sz w:val="22"/>
+        </w:rPr>
+      </w:r>
+      <w:r>
+        <w:rPr>
+          <w:rFonts w:ascii="Georgia" w:hAnsi="Georgia" w:cs="Georgia"/>
+          <w:b w:val="0"/>
+          <w:sz w:val="22"/>
+        </w:rPr>
+        <w:t>Four abstracts drawn from the pre-2023 pool were coded before the main corpus. The goal was to test the scheme, settle borderline cases, and see whether zero-hedge abstracts were common enough to shape the study design. Each abstract is given below with its coding summary.</w:t>
+      </w:r>
+    </w:p>
+    <w:p>
+      <w:pPr>
+        <w:keepNext/>
+        <w:keepLines/>
+        <w:spacing w:before="240" w:after="240" w:line="480" w:lineRule="auto"/>
+        <w:jc w:val="left"/>
+      </w:pPr>
+      <w:r>
+        <w:rPr>
+          <w:rFonts w:ascii="Georgia" w:hAnsi="Georgia" w:eastAsia="Georgia"/>
+          <w:b w:val="0"/>
+          <w:i/>
+          <w:sz w:val="24"/>
+        </w:rPr>
+        <w:t>Sample 1: Biology</w:t>
+      </w:r>
+    </w:p>
+    <w:p>
+      <w:pPr>
+        <w:spacing w:line="480" w:lineRule="auto" w:before="0" w:after="0"/>
+        <w:ind w:firstLine="720"/>
+        <w:jc w:val="both"/>
+      </w:pPr>
+      <w:r>
+        <w:rPr>
+          <w:rFonts w:ascii="Georgia" w:hAnsi="Georgia" w:eastAsia="Georgia"/>
+          <w:b w:val="0"/>
+          <w:i w:val="0"/>
+          <w:sz w:val="22"/>
+        </w:rPr>
+        <w:t>A field and laboratory monitoring was conducted at the Bureau of Fisheries and Aquatic Resources Regional Fish Health Laboratory 3 (BFAR RFHL3) and Zambales, Philippines to compare the effectiveness of Nested Polymerase Chain Reaction and Micro-Insulated Isothermal PCR (Pocket) in monitoring Acute Hepatopancreatic Necrosis Disease.</w:t>
+      </w:r>
+    </w:p>
+    <w:p>
+      <w:pPr>
+        <w:spacing w:line="480" w:lineRule="auto" w:before="0" w:after="0"/>
+        <w:ind w:firstLine="720"/>
+        <w:jc w:val="both"/>
+      </w:pPr>
+      <w:r>
+        <w:rPr>
+          <w:rFonts w:ascii="Georgia" w:hAnsi="Georgia" w:eastAsia="Georgia"/>
+          <w:b w:val="0"/>
+          <w:i w:val="0"/>
+          <w:sz w:val="22"/>
+        </w:rPr>
+        <w:t>A total of 33 samples were used in this study to compare the results of Nested Polymerase Chain Reaction and Micro-Insulated Isothermal Polymerase Chain Reaction (POCKIT) in monitoring Acute Hepatopancreatic Necrosis Disease-causing Vibrio parahaemolyticus. The study used collected shrimp samples, pre-detected samples, and positive and negative standards for the detection of Acute Hepatopancreatic Necrosis Disease-causing Vibrio parahaemolyticus on shrimp samples; bacterial culture for vibrio sp. was also conducted as well as dna sequencing for the confirmation of the results. The result showed negative results on all the shrimp samples that led to the conclusion that all shrimp farms were free from Acute Hepatopancreatic Necrosis Disease-causing Vibrio parahaemolyticus.</w:t>
+      </w:r>
+    </w:p>
+    <w:p>
+      <w:pPr>
+        <w:spacing w:line="480" w:lineRule="auto" w:before="0" w:after="0"/>
+        <w:ind w:firstLine="720"/>
+        <w:jc w:val="both"/>
+      </w:pPr>
+      <w:r>
+        <w:rPr>
+          <w:rFonts w:ascii="Georgia" w:hAnsi="Georgia" w:eastAsia="Georgia"/>
+          <w:b/>
+          <w:i w:val="0"/>
+          <w:sz w:val="22"/>
+        </w:rPr>
+        <w:t>Hedge Count: 0</w:t>
+      </w:r>
+    </w:p>
+    <w:p>
+      <w:pPr>
+        <w:spacing w:line="480" w:lineRule="auto" w:before="0" w:after="0"/>
+        <w:ind w:firstLine="720"/>
+        <w:jc w:val="both"/>
+      </w:pPr>
+      <w:r>
+        <w:rPr>
+          <w:rFonts w:ascii="Georgia" w:hAnsi="Georgia" w:eastAsia="Georgia"/>
+          <w:b w:val="0"/>
+          <w:i w:val="0"/>
+          <w:sz w:val="22"/>
+        </w:rPr>
+        <w:t>Analysis: The abstract relies entirely on factive verbs (conducted, showed, led to the conclusion). The final claim is presented as categorical with no qualification.</w:t>
+      </w:r>
+    </w:p>
+    <w:p>
+      <w:pPr>
+        <w:spacing w:line="480" w:lineRule="auto" w:before="0" w:after="0"/>
+        <w:ind w:firstLine="720"/>
+        <w:jc w:val="both"/>
+      </w:pPr>
+      <w:r>
+        <w:rPr>
+          <w:rFonts w:ascii="Georgia" w:hAnsi="Georgia" w:eastAsia="Georgia"/>
+          <w:b/>
+          <w:i w:val="0"/>
+          <w:sz w:val="22"/>
+        </w:rPr>
+        <w:t xml:space="preserve">Key Excerpt: </w:t>
+      </w:r>
+      <w:r>
+        <w:rPr>
+          <w:rFonts w:ascii="Georgia" w:hAnsi="Georgia" w:eastAsia="Georgia"/>
+          <w:b w:val="0"/>
+          <w:i w:val="0"/>
+          <w:sz w:val="22"/>
+        </w:rPr>
+        <w:t>“The result showed negative results that led to the conclusion that all shrimp farms were free…”</w:t>
+      </w:r>
+    </w:p>
+    <w:p>
+      <w:pPr>
+        <w:keepNext/>
+        <w:keepLines/>
+        <w:spacing w:before="240" w:after="240" w:line="480" w:lineRule="auto"/>
+        <w:jc w:val="left"/>
+      </w:pPr>
+      <w:r>
+        <w:rPr>
+          <w:rFonts w:ascii="Georgia" w:hAnsi="Georgia" w:eastAsia="Georgia"/>
+          <w:b w:val="0"/>
+          <w:i/>
+          <w:sz w:val="24"/>
+        </w:rPr>
+        <w:t>Sample 2: Veterinary Medicine</w:t>
+      </w:r>
+    </w:p>
+    <w:p>
+      <w:pPr>
+        <w:spacing w:line="480" w:lineRule="auto" w:before="0" w:after="0"/>
+        <w:ind w:firstLine="720"/>
+        <w:jc w:val="both"/>
+      </w:pPr>
+      <w:r>
+        <w:rPr>
+          <w:rFonts w:ascii="Georgia" w:hAnsi="Georgia" w:eastAsia="Georgia"/>
+          <w:b w:val="0"/>
+          <w:i w:val="0"/>
+          <w:sz w:val="22"/>
+        </w:rPr>
+        <w:t>The study was conducted to determine and compare the staining effect of C. longa, I. batatas and M. acuminata aqueous extracts for gonad examination of Nile tilapia. Twelve Nile tilapia fingerlings, with approximately two and one-half to four-inch size, were divided into four treatments with three replicates each. Treatment 1 was assigned as the positive control, which were stained with malachite green, while Treatments 2, 3 and 4 were stained with C. longa, I. batatas and M. acuminata extracts, respectively. The prepared slides of stained gonads were randomly distributed on the microscopes using completely randomized design (CRD). Blind examination and evaluation by five faculty members was done on the stained unlabeled tissues under the microscopes. The tissues were evaluated according to five parameters: hue, saturation, contrast, clarity and overall appearance. A scoring scheme was followed, i.e. 1 to 2 – very poor; 3 to 4 – poor; 5 to 6 – average; 7 to 8 – good; and 9 to 10 – excellent. Data gathered were subjected to one-way analysis of variance (ANOVA). The results suggested that C. longa, I. batatas and M. acuminata extracts are potential alternative stains for gonadal examination of Nile tilapia with M. acuminata as the most preferred.</w:t>
+      </w:r>
+    </w:p>
+    <w:p>
+      <w:pPr>
+        <w:spacing w:line="480" w:lineRule="auto" w:before="0" w:after="0"/>
+        <w:ind w:firstLine="720"/>
+        <w:jc w:val="both"/>
+      </w:pPr>
+      <w:r>
+        <w:rPr>
+          <w:rFonts w:ascii="Georgia" w:hAnsi="Georgia" w:eastAsia="Georgia"/>
+          <w:b/>
+          <w:i w:val="0"/>
+          <w:sz w:val="22"/>
+        </w:rPr>
+        <w:t>Hedge Count: 2</w:t>
+      </w:r>
+    </w:p>
+    <w:p>
+      <w:pPr>
+        <w:spacing w:line="480" w:lineRule="auto" w:before="0" w:after="0"/>
+        <w:ind w:firstLine="720"/>
+        <w:jc w:val="both"/>
+      </w:pPr>
+      <w:r>
+        <w:rPr>
+          <w:rFonts w:ascii="Georgia" w:hAnsi="Georgia" w:eastAsia="Georgia"/>
+          <w:b w:val="0"/>
+          <w:i w:val="0"/>
+          <w:sz w:val="22"/>
+        </w:rPr>
+        <w:t>Analysis: This abstract demonstrates awareness of claim management. Both hedges serve to qualify the final conclusion.</w:t>
+      </w:r>
+    </w:p>
+    <w:p>
+      <w:pPr>
+        <w:spacing w:line="480" w:lineRule="auto" w:before="0" w:after="0"/>
+        <w:ind w:firstLine="720"/>
+        <w:jc w:val="both"/>
+      </w:pPr>
+      <w:r>
+        <w:rPr>
+          <w:rFonts w:ascii="Georgia" w:hAnsi="Georgia" w:eastAsia="Georgia"/>
+          <w:b/>
+          <w:i w:val="0"/>
+          <w:sz w:val="22"/>
+        </w:rPr>
+        <w:t>Coded Instances:</w:t>
+      </w:r>
+    </w:p>
+    <w:p>
+      <w:pPr>
+        <w:spacing w:line="480" w:lineRule="auto" w:before="0" w:after="0"/>
+        <w:jc w:val="both"/>
+      </w:pPr>
+      <w:r>
+        <w:rPr>
+          <w:rFonts w:ascii="Georgia" w:hAnsi="Georgia" w:eastAsia="Georgia"/>
+          <w:b w:val="0"/>
+          <w:i w:val="0"/>
+          <w:sz w:val="22"/>
+        </w:rPr>
+        <w:t>“The results suggested that...” (Lexical Verb - Epistemic Caution)</w:t>
+      </w:r>
+    </w:p>
+    <w:p>
+      <w:pPr>
+        <w:spacing w:line="480" w:lineRule="auto" w:before="0" w:after="0"/>
+        <w:jc w:val="both"/>
+      </w:pPr>
+      <w:r>
+        <w:rPr>
+          <w:rFonts w:ascii="Georgia" w:hAnsi="Georgia" w:eastAsia="Georgia"/>
+          <w:b w:val="0"/>
+          <w:i w:val="0"/>
+          <w:sz w:val="22"/>
+        </w:rPr>
+        <w:t>“...extracts are potential alternative stains...” (Lexical Adjective - Epistemic Caution)</w:t>
+      </w:r>
+    </w:p>
+    <w:p>
+      <w:pPr>
+        <w:spacing w:line="480" w:lineRule="auto" w:before="0" w:after="0"/>
+        <w:ind w:firstLine="720"/>
+        <w:jc w:val="both"/>
+      </w:pPr>
+      <w:r>
+        <w:rPr>
+          <w:rFonts w:ascii="Georgia" w:hAnsi="Georgia" w:eastAsia="Georgia"/>
+          <w:b/>
+          <w:i w:val="0"/>
+          <w:sz w:val="22"/>
+        </w:rPr>
+        <w:t xml:space="preserve">Excluded: </w:t>
+      </w:r>
+      <w:r>
+        <w:rPr>
+          <w:rFonts w:ascii="Georgia" w:hAnsi="Georgia" w:eastAsia="Georgia"/>
+          <w:b w:val="0"/>
+          <w:i w:val="0"/>
+          <w:sz w:val="22"/>
+        </w:rPr>
+        <w:t>“approximately two and one-half” (Procedural measurement, not epistemic).</w:t>
+      </w:r>
+    </w:p>
+    <w:p>
+      <w:pPr>
+        <w:keepNext/>
+        <w:keepLines/>
+        <w:spacing w:before="240" w:after="240" w:line="480" w:lineRule="auto"/>
+        <w:jc w:val="left"/>
+      </w:pPr>
+      <w:r>
+        <w:rPr>
+          <w:rFonts w:ascii="Georgia" w:hAnsi="Georgia" w:eastAsia="Georgia"/>
+          <w:b w:val="0"/>
+          <w:i/>
+          <w:sz w:val="24"/>
+        </w:rPr>
+        <w:t>Sample 3: Agriculture (Animal Science)</w:t>
+      </w:r>
+    </w:p>
+    <w:p>
+      <w:pPr>
+        <w:spacing w:line="480" w:lineRule="auto" w:before="0" w:after="0"/>
+        <w:ind w:firstLine="720"/>
+        <w:jc w:val="both"/>
+      </w:pPr>
+      <w:r>
+        <w:rPr>
+          <w:rFonts w:ascii="Georgia" w:hAnsi="Georgia" w:eastAsia="Georgia"/>
+          <w:b w:val="0"/>
+          <w:i w:val="0"/>
+          <w:sz w:val="22"/>
+        </w:rPr>
+        <w:t>The study was conducted for 7 days from July 07 to July 13, 2022 at Brgy. San Roque, Magalang, Pampanga. The general objective of the study was to determine the acceptability and palatability of duck ham subjected to different curing process. Specifically, it aimed to find the sensory evaluation: appearance; aroma; taste/ flavor; texture; and over-all acceptability. A total of eight (8) Muscovy ducks were used in this study. The study used Hedonic Likert Scale and was subjected to Desriptive analysis. Factor A = Type of curing and Factor B = Spice rub. The treatments used in this study are the following. A₁ B₁ - Dry curing + Oregano, A₁ B₂ - Dry curing + Lemon grass, A₂ B₁ - Liquid curing + Oregano and A₁ B₂ - Liquid curing + Lemon grass. The sensory evaluation was conducted at Pampanga State Agricultural University, PAC, Magalang, Pampanga. Ten (10) college students, ten (10) teachers and ten (10) people who don’t eat duck were selected as respondents to evaluate the sample treatments. The data collected from the sensory evaluation were analysed using descriptive statistics.</w:t>
+      </w:r>
+    </w:p>
+    <w:p>
+      <w:pPr>
+        <w:spacing w:line="480" w:lineRule="auto" w:before="0" w:after="0"/>
+        <w:ind w:firstLine="720"/>
+        <w:jc w:val="both"/>
+      </w:pPr>
+      <w:r>
+        <w:rPr>
+          <w:rFonts w:ascii="Georgia" w:hAnsi="Georgia" w:eastAsia="Georgia"/>
+          <w:b w:val="0"/>
+          <w:i w:val="0"/>
+          <w:sz w:val="22"/>
+        </w:rPr>
+        <w:t>Results of the study showed that Comparison on Curing Methods Using Oregano - dry cured duck ham had the highest rating with regards to appearance, texture and overall acceptability. While liquid cure duck ham got the highest rating in terms of aroma and taste/flavor. Comparison on Curing Methods Using Lemon Grass - liquid cured duck ham had the highest rating in terms to appearance, aroma, taste/flavor, texture and overall acceptability. Comparison of Spices on Dry Curing (Smoking) - dry cure duck ham smoked in lemon grass had the highest rating in terms of appearance, aroma, taste/flavor, texture and overall acceptability. Comparison of Spices on Liquid Smoke - liquid cured duck ham smoked in lemon grass had the highest rating in relation to appearance, aroma, taste/flavor, texture and overall acceptability. Descriptive rating revealed that all the treatment with regards to appearance, aroma, taste/flavor, texture and overall acceptability were rated moderately like.</w:t>
+      </w:r>
+    </w:p>
+    <w:p>
+      <w:pPr>
+        <w:spacing w:line="480" w:lineRule="auto" w:before="0" w:after="0"/>
+        <w:ind w:firstLine="720"/>
+        <w:jc w:val="both"/>
+      </w:pPr>
+      <w:r>
+        <w:rPr>
+          <w:rFonts w:ascii="Georgia" w:hAnsi="Georgia" w:eastAsia="Georgia"/>
+          <w:b/>
+          <w:i w:val="0"/>
+          <w:sz w:val="22"/>
+        </w:rPr>
+        <w:t>Hedge Count: 0</w:t>
+      </w:r>
+    </w:p>
+    <w:p>
+      <w:pPr>
+        <w:spacing w:line="480" w:lineRule="auto" w:before="0" w:after="0"/>
+        <w:ind w:firstLine="720"/>
+        <w:jc w:val="both"/>
+      </w:pPr>
+      <w:r>
+        <w:rPr>
+          <w:rFonts w:ascii="Georgia" w:hAnsi="Georgia" w:eastAsia="Georgia"/>
+          <w:b w:val="0"/>
+          <w:i w:val="0"/>
+          <w:sz w:val="22"/>
+        </w:rPr>
+        <w:t>Analysis: The abstract uses factive reporting verbs (showed, revealed). Sensory evaluation ratings are reported as absolute data points. The term “moderately like” describes a Likert scale variable, not an epistemic qualification.</w:t>
+      </w:r>
+    </w:p>
+    <w:p>
+      <w:pPr>
+        <w:spacing w:line="480" w:lineRule="auto" w:before="0" w:after="0"/>
+        <w:ind w:firstLine="720"/>
+        <w:jc w:val="both"/>
+      </w:pPr>
+      <w:r>
+        <w:rPr>
+          <w:rFonts w:ascii="Georgia" w:hAnsi="Georgia" w:eastAsia="Georgia"/>
+          <w:b/>
+          <w:i w:val="0"/>
+          <w:sz w:val="22"/>
+        </w:rPr>
+        <w:t xml:space="preserve">Key Excerpt: </w:t>
+      </w:r>
+      <w:r>
+        <w:rPr>
+          <w:rFonts w:ascii="Georgia" w:hAnsi="Georgia" w:eastAsia="Georgia"/>
+          <w:b w:val="0"/>
+          <w:i w:val="0"/>
+          <w:sz w:val="22"/>
+        </w:rPr>
+        <w:t>“Results of the study showed that Comparison on Curing Methods…”</w:t>
+      </w:r>
+    </w:p>
+    <w:p>
+      <w:pPr>
+        <w:keepNext/>
+        <w:keepLines/>
+        <w:spacing w:before="240" w:after="240" w:line="480" w:lineRule="auto"/>
+        <w:jc w:val="left"/>
+      </w:pPr>
+      <w:r>
+        <w:rPr>
+          <w:rFonts w:ascii="Georgia" w:hAnsi="Georgia" w:eastAsia="Georgia"/>
+          <w:b w:val="0"/>
+          <w:i/>
+          <w:sz w:val="24"/>
+        </w:rPr>
+        <w:t>Sample 4: Agriculture (Crop Science)</w:t>
+      </w:r>
+    </w:p>
+    <w:p>
+      <w:pPr>
+        <w:spacing w:line="480" w:lineRule="auto" w:before="0" w:after="0"/>
+        <w:ind w:firstLine="720"/>
+        <w:jc w:val="both"/>
+      </w:pPr>
+      <w:r>
+        <w:rPr>
+          <w:rFonts w:ascii="Georgia" w:hAnsi="Georgia" w:eastAsia="Georgia"/>
+          <w:b w:val="0"/>
+          <w:i w:val="0"/>
+          <w:sz w:val="22"/>
+        </w:rPr>
+        <w:t>The study was conducted from June to July 2022 to determine the influence of the different sources of nutrients to rice straw mushrooms. The field experiment was conducted in Sitio Pitabacan, San Ildefonso, Magalang, Pampanga. The experiment was laid out using Complete Randomize Design (CRD), with four treatments replicated four times. The treatments were as follows: T₀- Untreated banana leaves substrate submerged in 55 gallon of water (Control); T₁- Banana leaves substrate submerged in mixture of 100 grams of Urea and 55 gallons of water; T₂- Banana leaves substrate submerged in mixture of 250 ml of fish amino acid and 55 gallons of water; and, T₃- Banana leaves substrate submerged in mixture of 250 ml of fermented plant juice and 55 gallons of water.</w:t>
+      </w:r>
+    </w:p>
+    <w:p>
+      <w:pPr>
+        <w:spacing w:line="480" w:lineRule="auto" w:before="0" w:after="0"/>
+        <w:ind w:firstLine="720"/>
+        <w:jc w:val="both"/>
+      </w:pPr>
+      <w:r>
+        <w:rPr>
+          <w:rFonts w:ascii="Georgia" w:hAnsi="Georgia" w:eastAsia="Georgia"/>
+          <w:b w:val="0"/>
+          <w:i w:val="0"/>
+          <w:sz w:val="22"/>
+        </w:rPr>
+        <w:t>Results of the study revealed significant differences in the following parameters: average weight of button harvested, number of buttons harvested, average yield per harvest, and biological efficiency of rice straw mushroom. However, insignificant differences were observed on the days of pinhead appearance and days of harvesting. The highest ROI was obtained in T₁- Banana leaves substrate submerged in a mixture of 100 grams of Urea and 55 gallons of water with every peso of investment 1.01 pesos of net income return.</w:t>
+      </w:r>
+    </w:p>
+    <w:p>
+      <w:pPr>
+        <w:spacing w:line="480" w:lineRule="auto" w:before="0" w:after="0"/>
+        <w:ind w:firstLine="720"/>
+        <w:jc w:val="both"/>
+      </w:pPr>
+      <w:r>
+        <w:rPr>
+          <w:rFonts w:ascii="Georgia" w:hAnsi="Georgia" w:eastAsia="Georgia"/>
+          <w:b/>
+          <w:i w:val="0"/>
+          <w:sz w:val="22"/>
+        </w:rPr>
+        <w:t>Hedge Count: 0</w:t>
+      </w:r>
+    </w:p>
+    <w:p>
+      <w:pPr>
+        <w:spacing w:line="480" w:lineRule="auto" w:before="0" w:after="0"/>
+        <w:ind w:firstLine="720"/>
+        <w:jc w:val="both"/>
+      </w:pPr>
+      <w:r>
+        <w:rPr>
+          <w:rFonts w:ascii="Georgia" w:hAnsi="Georgia" w:eastAsia="Georgia"/>
+          <w:b w:val="0"/>
+          <w:i w:val="0"/>
+          <w:sz w:val="22"/>
+        </w:rPr>
+        <w:t>Analysis: Statistical significance is reported as fact (revealed significant differences). No devices are used to qualify the biological efficiency or yield claims.</w:t>
+      </w:r>
+    </w:p>
+    <w:p>
+      <w:pPr>
+        <w:spacing w:line="480" w:lineRule="auto" w:before="0" w:after="0"/>
+        <w:ind w:firstLine="720"/>
+        <w:jc w:val="both"/>
+      </w:pPr>
+      <w:r>
+        <w:rPr>
+          <w:rFonts w:ascii="Georgia" w:hAnsi="Georgia" w:eastAsia="Georgia"/>
+          <w:b/>
+          <w:i w:val="0"/>
+          <w:sz w:val="22"/>
+        </w:rPr>
+        <w:t xml:space="preserve">Key Excerpt: </w:t>
+      </w:r>
+      <w:r>
+        <w:rPr>
+          <w:rFonts w:ascii="Georgia" w:hAnsi="Georgia" w:eastAsia="Georgia"/>
+          <w:b w:val="0"/>
+          <w:i w:val="0"/>
+          <w:sz w:val="22"/>
+        </w:rPr>
+        <w:t>“Results of the study revealed significant differences... The highest ROI was obtained…”</w:t>
+      </w:r>
+    </w:p>
+    <w:p>
+      <w:pPr>
+        <w:keepNext/>
+        <w:keepLines/>
+        <w:spacing w:before="240" w:after="240" w:line="480" w:lineRule="auto"/>
+        <w:jc w:val="left"/>
+      </w:pPr>
+      <w:r>
+        <w:rPr>
+          <w:rFonts w:ascii="Georgia" w:hAnsi="Georgia" w:eastAsia="Georgia"/>
+          <w:b w:val="0"/>
+          <w:i/>
+          <w:sz w:val="24"/>
+        </w:rPr>
+      </w:r>
+      <w:r>
+        <w:rPr>
+          <w:rFonts w:ascii="Georgia" w:hAnsi="Georgia" w:cs="Georgia"/>
+          <w:b/>
+          <w:sz w:val="22"/>
+        </w:rPr>
+        <w:t>General observation from the pilot</w:t>
+      </w:r>
+    </w:p>
+    <w:p>
+      <w:pPr>
+        <w:spacing w:line="480" w:lineRule="auto" w:before="0" w:after="0"/>
+        <w:ind w:firstLine="720"/>
+        <w:jc w:val="left"/>
+      </w:pPr>
+      <w:r>
+        <w:rPr>
+          <w:rFonts w:ascii="Georgia" w:hAnsi="Georgia" w:eastAsia="Georgia"/>
+          <w:b w:val="0"/>
+          <w:i w:val="0"/>
+          <w:sz w:val="22"/>
+        </w:rPr>
+      </w:r>
+      <w:r>
+        <w:rPr>
+          <w:rFonts w:ascii="Georgia" w:hAnsi="Georgia" w:cs="Georgia"/>
+          <w:b w:val="0"/>
+          <w:sz w:val="22"/>
+        </w:rPr>
+        <w:t>Three of the four pilot abstracts contained no coded hedges. The pattern pointed to a high base rate of zero-hedge writing in the local undergraduate abstract genre and confirmed that a descriptive baseline study was warranted. The same decision rules and Working Test were carried forward into the main coding of the 60-abstract corpus.</w:t>
+      </w:r>
+    </w:p>
+    <w:p>
+      <w:pPr>
+        <w:sectPr>
+          <w:headerReference w:type="default" r:id="rId20"/>
+          <w:headerReference w:type="first" r:id="rId21"/>
+          <w:pgSz w:w="11906" w:h="16838"/>
+          <w:pgMar w:top="1440" w:right="1440" w:bottom="1440" w:left="2160" w:header="720" w:footer="720" w:gutter="0"/>
+          <w:cols w:space="720"/>
+          <w:titlePg/>
+          <w:docGrid w:linePitch="360"/>
+        </w:sectPr>
+      </w:pPr>
+    </w:p>
+    <w:p>
+      <w:pPr>
+        <w:spacing w:before="0" w:after="0" w:line="240" w:lineRule="auto"/>
+      </w:pPr>
+      <w:r>
+        <w:rPr>
+          <w:rFonts w:ascii="Georgia" w:hAnsi="Georgia" w:eastAsia="Georgia"/>
+          <w:b w:val="0"/>
+          <w:i w:val="0"/>
+          <w:sz w:val="22"/>
+        </w:rPr>
+      </w:r>
+    </w:p>
+    <w:p>
+      <w:pPr>
+        <w:spacing w:before="0" w:after="0" w:line="240" w:lineRule="auto"/>
+      </w:pPr>
+      <w:r>
+        <w:rPr>
+          <w:rFonts w:ascii="Georgia" w:hAnsi="Georgia" w:eastAsia="Georgia"/>
+          <w:b w:val="0"/>
+          <w:i w:val="0"/>
+          <w:sz w:val="22"/>
+        </w:rPr>
+      </w:r>
+    </w:p>
+    <w:p>
+      <w:pPr>
+        <w:spacing w:before="0" w:after="0" w:line="240" w:lineRule="auto"/>
+      </w:pPr>
+      <w:r>
+        <w:rPr>
+          <w:rFonts w:ascii="Georgia" w:hAnsi="Georgia" w:eastAsia="Georgia"/>
+          <w:b w:val="0"/>
+          <w:i w:val="0"/>
+          <w:sz w:val="22"/>
+        </w:rPr>
+      </w:r>
+    </w:p>
+    <w:p>
+      <w:pPr>
+        <w:spacing w:before="0" w:after="0" w:line="480" w:lineRule="auto"/>
+        <w:jc w:val="center"/>
+      </w:pPr>
+      <w:r>
+        <w:rPr>
+          <w:rFonts w:ascii="Georgia" w:hAnsi="Georgia" w:eastAsia="Georgia"/>
+          <w:b/>
+          <w:i w:val="0"/>
+          <w:sz w:val="28"/>
+        </w:rPr>
+      </w:r>
+      <w:r>
+        <w:rPr>
+          <w:rFonts w:ascii="Georgia" w:hAnsi="Georgia" w:cs="Georgia"/>
+          <w:b/>
+          <w:sz w:val="28"/>
+        </w:rPr>
+        <w:t>APPENDIX C: CODED CORPUS WITH HIGHLIGHTS</w:t>
       </w:r>
     </w:p>
     <w:p>

</xml_diff>

<commit_message>
Tighten Appendix A quick-ref spacing in Draft_009
- Reduce space between list items and decision rules
- Clear separation before QUICK-REFERENCE and FULL CODEBOOK
- Align paragraph spacing with body conventions
</commit_message>
<xml_diff>
--- a/thesis/003_ThesisProposal_Draft_009.docx
+++ b/thesis/003_ThesisProposal_Draft_009.docx
@@ -7299,7 +7299,7 @@
       <w:pPr>
         <w:keepNext/>
         <w:keepLines/>
-        <w:spacing w:before="0" w:after="0" w:line="480" w:lineRule="auto"/>
+        <w:spacing w:before="0" w:after="240" w:line="240" w:lineRule="auto"/>
         <w:jc w:val="center"/>
       </w:pPr>
       <w:r>
@@ -7353,7 +7353,7 @@
     </w:p>
     <w:p>
       <w:pPr>
-        <w:spacing w:before="0" w:after="0" w:line="480" w:lineRule="auto"/>
+        <w:spacing w:before="120" w:after="200" w:line="240" w:lineRule="auto"/>
         <w:jc w:val="center"/>
       </w:pPr>
       <w:r>
@@ -7375,7 +7375,7 @@
     </w:p>
     <w:p>
       <w:pPr>
-        <w:spacing w:before="0" w:after="0" w:line="240" w:lineRule="auto"/>
+        <w:spacing w:before="0" w:after="120" w:line="240" w:lineRule="auto"/>
         <w:jc w:val="left"/>
       </w:pPr>
       <w:r>
@@ -7397,14 +7397,14 @@
     </w:p>
     <w:p>
       <w:pPr>
-        <w:spacing w:line="480" w:lineRule="auto" w:before="0" w:after="0"/>
+        <w:spacing w:line="240" w:lineRule="auto" w:before="240" w:after="120"/>
         <w:ind w:firstLine="720"/>
         <w:jc w:val="left"/>
       </w:pPr>
       <w:r>
         <w:rPr>
           <w:rFonts w:ascii="Georgia" w:hAnsi="Georgia" w:eastAsia="Georgia"/>
-          <w:b w:val="0"/>
+          <w:b/>
           <w:i w:val="0"/>
           <w:sz w:val="22"/>
         </w:rPr>
@@ -7422,7 +7422,7 @@
       <w:pPr>
         <w:keepNext/>
         <w:keepLines/>
-        <w:spacing w:before="240" w:after="240" w:line="480" w:lineRule="auto"/>
+        <w:spacing w:before="0" w:after="120" w:line="240" w:lineRule="auto"/>
         <w:jc w:val="left"/>
       </w:pPr>
       <w:r>
@@ -7444,13 +7444,13 @@
     </w:p>
     <w:p>
       <w:pPr>
-        <w:spacing w:line="480" w:lineRule="auto" w:before="0" w:after="0"/>
+        <w:spacing w:line="240" w:lineRule="auto" w:before="200" w:after="80"/>
         <w:jc w:val="left"/>
       </w:pPr>
       <w:r>
         <w:rPr>
           <w:rFonts w:ascii="Georgia" w:hAnsi="Georgia" w:eastAsia="Georgia"/>
-          <w:b w:val="0"/>
+          <w:b/>
           <w:i w:val="0"/>
           <w:sz w:val="22"/>
         </w:rPr>
@@ -7466,7 +7466,8 @@
     </w:p>
     <w:p>
       <w:pPr>
-        <w:spacing w:line="480" w:lineRule="auto" w:before="0" w:after="0"/>
+        <w:spacing w:line="240" w:lineRule="auto" w:before="0" w:after="60"/>
+        <w:ind w:left="240"/>
         <w:jc w:val="left"/>
       </w:pPr>
       <w:r>
@@ -7488,7 +7489,8 @@
     </w:p>
     <w:p>
       <w:pPr>
-        <w:spacing w:line="480" w:lineRule="auto" w:before="0" w:after="0"/>
+        <w:spacing w:line="240" w:lineRule="auto" w:before="0" w:after="60"/>
+        <w:ind w:left="240"/>
         <w:jc w:val="left"/>
       </w:pPr>
       <w:r>
@@ -7510,7 +7512,8 @@
     </w:p>
     <w:p>
       <w:pPr>
-        <w:spacing w:line="480" w:lineRule="auto" w:before="0" w:after="0"/>
+        <w:spacing w:line="240" w:lineRule="auto" w:before="0" w:after="60"/>
+        <w:ind w:left="240"/>
         <w:jc w:val="left"/>
       </w:pPr>
       <w:r>
@@ -7534,7 +7537,8 @@
       <w:pPr>
         <w:keepNext/>
         <w:keepLines/>
-        <w:spacing w:before="240" w:after="240" w:line="480" w:lineRule="auto"/>
+        <w:spacing w:before="0" w:after="60" w:line="240" w:lineRule="auto"/>
+        <w:ind w:left="240"/>
         <w:jc w:val="left"/>
       </w:pPr>
       <w:r>
@@ -7556,7 +7560,7 @@
     </w:p>
     <w:p>
       <w:pPr>
-        <w:spacing w:line="480" w:lineRule="auto" w:before="0" w:after="0"/>
+        <w:spacing w:line="240" w:lineRule="auto" w:before="200" w:after="80"/>
         <w:ind w:firstLine="720"/>
         <w:jc w:val="left"/>
       </w:pPr>
@@ -7571,7 +7575,7 @@
       <w:r>
         <w:rPr>
           <w:rFonts w:ascii="Georgia" w:hAnsi="Georgia" w:eastAsia="Georgia"/>
-          <w:b w:val="0"/>
+          <w:b/>
           <w:i w:val="0"/>
           <w:sz w:val="22"/>
         </w:rPr>
@@ -7587,7 +7591,94 @@
     </w:p>
     <w:p>
       <w:pPr>
-        <w:spacing w:line="480" w:lineRule="auto" w:before="0" w:after="0"/>
+        <w:spacing w:line="240" w:lineRule="auto" w:before="0" w:after="60"/>
+        <w:ind w:firstLine="720" w:left="240"/>
+        <w:jc w:val="left"/>
+      </w:pPr>
+      <w:r>
+        <w:rPr>
+          <w:rFonts w:ascii="Georgia" w:hAnsi="Georgia" w:eastAsia="Georgia"/>
+          <w:b/>
+          <w:i w:val="0"/>
+          <w:sz w:val="22"/>
+        </w:rPr>
+      </w:r>
+      <w:r>
+        <w:rPr>
+          <w:rFonts w:ascii="Georgia" w:hAnsi="Georgia" w:eastAsia="Georgia"/>
+          <w:b w:val="0"/>
+          <w:i w:val="0"/>
+          <w:sz w:val="22"/>
+        </w:rPr>
+      </w:r>
+      <w:r>
+        <w:rPr>
+          <w:rFonts w:ascii="Georgia" w:hAnsi="Georgia" w:cs="Georgia"/>
+          <w:b w:val="0"/>
+          <w:sz w:val="22"/>
+        </w:rPr>
+        <w:t>Epistemic Caution: marks uncertainty about whether a claim is true (e.g., The treatment may reduce infection rates).</w:t>
+      </w:r>
+    </w:p>
+    <w:p>
+      <w:pPr>
+        <w:spacing w:line="240" w:lineRule="auto" w:before="0" w:after="60"/>
+        <w:ind w:firstLine="720" w:left="240"/>
+        <w:jc w:val="left"/>
+      </w:pPr>
+      <w:r>
+        <w:rPr>
+          <w:rFonts w:ascii="Georgia" w:hAnsi="Georgia" w:eastAsia="Georgia"/>
+          <w:b/>
+          <w:i w:val="0"/>
+          <w:sz w:val="22"/>
+        </w:rPr>
+      </w:r>
+      <w:r>
+        <w:rPr>
+          <w:rFonts w:ascii="Georgia" w:hAnsi="Georgia" w:eastAsia="Georgia"/>
+          <w:b w:val="0"/>
+          <w:i w:val="0"/>
+          <w:sz w:val="22"/>
+        </w:rPr>
+      </w:r>
+      <w:r>
+        <w:rPr>
+          <w:rFonts w:ascii="Georgia" w:hAnsi="Georgia" w:cs="Georgia"/>
+          <w:b w:val="0"/>
+          <w:sz w:val="22"/>
+        </w:rPr>
+        <w:t>Politeness / Deference: softens face threat or shows respect rather than genuine doubt (e.g., As suggested by Hyland…).</w:t>
+      </w:r>
+    </w:p>
+    <w:p>
+      <w:pPr>
+        <w:keepNext/>
+        <w:keepLines/>
+        <w:spacing w:before="0" w:after="60" w:line="240" w:lineRule="auto"/>
+        <w:ind w:left="240"/>
+        <w:jc w:val="left"/>
+      </w:pPr>
+      <w:r>
+        <w:rPr>
+          <w:rFonts w:ascii="Georgia" w:hAnsi="Georgia" w:eastAsia="Georgia"/>
+          <w:b w:val="0"/>
+          <w:i/>
+          <w:sz w:val="24"/>
+        </w:rPr>
+      </w:r>
+      <w:r>
+        <w:rPr>
+          <w:rFonts w:ascii="Georgia" w:hAnsi="Georgia" w:cs="Georgia"/>
+          <w:b w:val="0"/>
+          <w:sz w:val="22"/>
+        </w:rPr>
+        <w:t>Discourse Organization: manages text structure or reader expectations rather than stance (e.g., It should be noted that…).</w:t>
+      </w:r>
+    </w:p>
+    <w:p>
+      <w:pPr>
+        <w:spacing w:line="240" w:lineRule="auto" w:before="200" w:after="80"/>
         <w:ind w:firstLine="720"/>
         <w:jc w:val="left"/>
       </w:pPr>
@@ -7602,93 +7693,7 @@
       <w:r>
         <w:rPr>
           <w:rFonts w:ascii="Georgia" w:hAnsi="Georgia" w:eastAsia="Georgia"/>
-          <w:b w:val="0"/>
-          <w:i w:val="0"/>
-          <w:sz w:val="22"/>
-        </w:rPr>
-      </w:r>
-      <w:r>
-        <w:rPr>
-          <w:rFonts w:ascii="Georgia" w:hAnsi="Georgia" w:cs="Georgia"/>
-          <w:b w:val="0"/>
-          <w:sz w:val="22"/>
-        </w:rPr>
-        <w:t>Epistemic Caution: marks uncertainty about whether a claim is true (e.g., The treatment may reduce infection rates).</w:t>
-      </w:r>
-    </w:p>
-    <w:p>
-      <w:pPr>
-        <w:spacing w:line="480" w:lineRule="auto" w:before="0" w:after="0"/>
-        <w:ind w:firstLine="720"/>
-        <w:jc w:val="left"/>
-      </w:pPr>
-      <w:r>
-        <w:rPr>
-          <w:rFonts w:ascii="Georgia" w:hAnsi="Georgia" w:eastAsia="Georgia"/>
           <w:b/>
-          <w:i w:val="0"/>
-          <w:sz w:val="22"/>
-        </w:rPr>
-      </w:r>
-      <w:r>
-        <w:rPr>
-          <w:rFonts w:ascii="Georgia" w:hAnsi="Georgia" w:eastAsia="Georgia"/>
-          <w:b w:val="0"/>
-          <w:i w:val="0"/>
-          <w:sz w:val="22"/>
-        </w:rPr>
-      </w:r>
-      <w:r>
-        <w:rPr>
-          <w:rFonts w:ascii="Georgia" w:hAnsi="Georgia" w:cs="Georgia"/>
-          <w:b w:val="0"/>
-          <w:sz w:val="22"/>
-        </w:rPr>
-        <w:t>Politeness / Deference: softens face threat or shows respect rather than genuine doubt (e.g., As suggested by Hyland…).</w:t>
-      </w:r>
-    </w:p>
-    <w:p>
-      <w:pPr>
-        <w:keepNext/>
-        <w:keepLines/>
-        <w:spacing w:before="240" w:after="240" w:line="480" w:lineRule="auto"/>
-        <w:jc w:val="left"/>
-      </w:pPr>
-      <w:r>
-        <w:rPr>
-          <w:rFonts w:ascii="Georgia" w:hAnsi="Georgia" w:eastAsia="Georgia"/>
-          <w:b w:val="0"/>
-          <w:i/>
-          <w:sz w:val="24"/>
-        </w:rPr>
-      </w:r>
-      <w:r>
-        <w:rPr>
-          <w:rFonts w:ascii="Georgia" w:hAnsi="Georgia" w:cs="Georgia"/>
-          <w:b w:val="0"/>
-          <w:sz w:val="22"/>
-        </w:rPr>
-        <w:t>Discourse Organization: manages text structure or reader expectations rather than stance (e.g., It should be noted that…).</w:t>
-      </w:r>
-    </w:p>
-    <w:p>
-      <w:pPr>
-        <w:spacing w:line="480" w:lineRule="auto" w:before="0" w:after="0"/>
-        <w:ind w:firstLine="720"/>
-        <w:jc w:val="left"/>
-      </w:pPr>
-      <w:r>
-        <w:rPr>
-          <w:rFonts w:ascii="Georgia" w:hAnsi="Georgia" w:eastAsia="Georgia"/>
-          <w:b/>
-          <w:i w:val="0"/>
-          <w:sz w:val="22"/>
-        </w:rPr>
-      </w:r>
-      <w:r>
-        <w:rPr>
-          <w:rFonts w:ascii="Georgia" w:hAnsi="Georgia" w:eastAsia="Georgia"/>
-          <w:b w:val="0"/>
           <w:i w:val="0"/>
           <w:sz w:val="22"/>
         </w:rPr>
@@ -7704,7 +7709,125 @@
     </w:p>
     <w:p>
       <w:pPr>
-        <w:spacing w:line="480" w:lineRule="auto" w:before="0" w:after="0"/>
+        <w:spacing w:line="240" w:lineRule="auto" w:before="0" w:after="60"/>
+        <w:ind w:firstLine="720" w:left="240"/>
+        <w:jc w:val="left"/>
+      </w:pPr>
+      <w:r>
+        <w:rPr>
+          <w:rFonts w:ascii="Georgia" w:hAnsi="Georgia" w:eastAsia="Georgia"/>
+          <w:b/>
+          <w:i w:val="0"/>
+          <w:sz w:val="22"/>
+        </w:rPr>
+      </w:r>
+      <w:r>
+        <w:rPr>
+          <w:rFonts w:ascii="Georgia" w:hAnsi="Georgia" w:eastAsia="Georgia"/>
+          <w:b w:val="0"/>
+          <w:i w:val="0"/>
+          <w:sz w:val="22"/>
+        </w:rPr>
+      </w:r>
+      <w:r>
+        <w:rPr>
+          <w:rFonts w:ascii="Georgia" w:hAnsi="Georgia" w:cs="Georgia"/>
+          <w:b w:val="0"/>
+          <w:sz w:val="22"/>
+        </w:rPr>
+        <w:t>suggest / indicate → hedge when introducing a finding; not a hedge when introducing a recommendation.</w:t>
+      </w:r>
+    </w:p>
+    <w:p>
+      <w:pPr>
+        <w:spacing w:line="240" w:lineRule="auto" w:before="0" w:after="60"/>
+        <w:ind w:firstLine="720" w:left="240"/>
+        <w:jc w:val="left"/>
+      </w:pPr>
+      <w:r>
+        <w:rPr>
+          <w:rFonts w:ascii="Georgia" w:hAnsi="Georgia" w:eastAsia="Georgia"/>
+          <w:b/>
+          <w:i w:val="0"/>
+          <w:sz w:val="22"/>
+        </w:rPr>
+      </w:r>
+      <w:r>
+        <w:rPr>
+          <w:rFonts w:ascii="Georgia" w:hAnsi="Georgia" w:eastAsia="Georgia"/>
+          <w:b w:val="0"/>
+          <w:i w:val="0"/>
+          <w:sz w:val="22"/>
+        </w:rPr>
+      </w:r>
+      <w:r>
+        <w:rPr>
+          <w:rFonts w:ascii="Georgia" w:hAnsi="Georgia" w:cs="Georgia"/>
+          <w:b w:val="0"/>
+          <w:sz w:val="22"/>
+        </w:rPr>
+        <w:t>can / may → hedge when marking possibility; not a hedge when marking capability.</w:t>
+      </w:r>
+    </w:p>
+    <w:p>
+      <w:pPr>
+        <w:spacing w:line="240" w:lineRule="auto" w:before="0" w:after="60"/>
+        <w:ind w:firstLine="720" w:left="240"/>
+        <w:jc w:val="left"/>
+      </w:pPr>
+      <w:r>
+        <w:rPr>
+          <w:rFonts w:ascii="Georgia" w:hAnsi="Georgia" w:eastAsia="Georgia"/>
+          <w:b/>
+          <w:i w:val="0"/>
+          <w:sz w:val="22"/>
+        </w:rPr>
+      </w:r>
+      <w:r>
+        <w:rPr>
+          <w:rFonts w:ascii="Georgia" w:hAnsi="Georgia" w:eastAsia="Georgia"/>
+          <w:b w:val="0"/>
+          <w:i w:val="0"/>
+          <w:sz w:val="22"/>
+        </w:rPr>
+      </w:r>
+      <w:r>
+        <w:rPr>
+          <w:rFonts w:ascii="Georgia" w:hAnsi="Georgia" w:cs="Georgia"/>
+          <w:b w:val="0"/>
+          <w:sz w:val="22"/>
+        </w:rPr>
+        <w:t>generally / typically → hedge when limiting the scope of a claim; not a hedge when describing a procedural norm.</w:t>
+      </w:r>
+    </w:p>
+    <w:p>
+      <w:pPr>
+        <w:keepNext/>
+        <w:keepLines/>
+        <w:spacing w:before="0" w:after="60" w:line="240" w:lineRule="auto"/>
+        <w:ind w:left="240"/>
+        <w:jc w:val="left"/>
+      </w:pPr>
+      <w:r>
+        <w:rPr>
+          <w:rFonts w:ascii="Georgia" w:hAnsi="Georgia" w:eastAsia="Georgia"/>
+          <w:b w:val="0"/>
+          <w:i/>
+          <w:sz w:val="24"/>
+        </w:rPr>
+      </w:r>
+      <w:r>
+        <w:rPr>
+          <w:rFonts w:ascii="Georgia" w:hAnsi="Georgia" w:cs="Georgia"/>
+          <w:b w:val="0"/>
+          <w:sz w:val="22"/>
+        </w:rPr>
+        <w:t>appear / seem → hedge when expressing uncertainty about a result; not a hedge when pointing to location in a table or text.</w:t>
+      </w:r>
+    </w:p>
+    <w:p>
+      <w:pPr>
+        <w:spacing w:line="240" w:lineRule="auto" w:before="200" w:after="80"/>
         <w:ind w:firstLine="720"/>
         <w:jc w:val="left"/>
       </w:pPr>
@@ -7712,123 +7835,6 @@
         <w:rPr>
           <w:rFonts w:ascii="Georgia" w:hAnsi="Georgia" w:eastAsia="Georgia"/>
           <w:b/>
-          <w:i w:val="0"/>
-          <w:sz w:val="22"/>
-        </w:rPr>
-      </w:r>
-      <w:r>
-        <w:rPr>
-          <w:rFonts w:ascii="Georgia" w:hAnsi="Georgia" w:eastAsia="Georgia"/>
-          <w:b w:val="0"/>
-          <w:i w:val="0"/>
-          <w:sz w:val="22"/>
-        </w:rPr>
-      </w:r>
-      <w:r>
-        <w:rPr>
-          <w:rFonts w:ascii="Georgia" w:hAnsi="Georgia" w:cs="Georgia"/>
-          <w:b w:val="0"/>
-          <w:sz w:val="22"/>
-        </w:rPr>
-        <w:t>suggest / indicate → hedge when introducing a finding; not a hedge when introducing a recommendation.</w:t>
-      </w:r>
-    </w:p>
-    <w:p>
-      <w:pPr>
-        <w:spacing w:line="480" w:lineRule="auto" w:before="0" w:after="0"/>
-        <w:ind w:firstLine="720"/>
-        <w:jc w:val="left"/>
-      </w:pPr>
-      <w:r>
-        <w:rPr>
-          <w:rFonts w:ascii="Georgia" w:hAnsi="Georgia" w:eastAsia="Georgia"/>
-          <w:b/>
-          <w:i w:val="0"/>
-          <w:sz w:val="22"/>
-        </w:rPr>
-      </w:r>
-      <w:r>
-        <w:rPr>
-          <w:rFonts w:ascii="Georgia" w:hAnsi="Georgia" w:eastAsia="Georgia"/>
-          <w:b w:val="0"/>
-          <w:i w:val="0"/>
-          <w:sz w:val="22"/>
-        </w:rPr>
-      </w:r>
-      <w:r>
-        <w:rPr>
-          <w:rFonts w:ascii="Georgia" w:hAnsi="Georgia" w:cs="Georgia"/>
-          <w:b w:val="0"/>
-          <w:sz w:val="22"/>
-        </w:rPr>
-        <w:t>can / may → hedge when marking possibility; not a hedge when marking capability.</w:t>
-      </w:r>
-    </w:p>
-    <w:p>
-      <w:pPr>
-        <w:spacing w:line="480" w:lineRule="auto" w:before="0" w:after="0"/>
-        <w:ind w:firstLine="720"/>
-        <w:jc w:val="left"/>
-      </w:pPr>
-      <w:r>
-        <w:rPr>
-          <w:rFonts w:ascii="Georgia" w:hAnsi="Georgia" w:eastAsia="Georgia"/>
-          <w:b/>
-          <w:i w:val="0"/>
-          <w:sz w:val="22"/>
-        </w:rPr>
-      </w:r>
-      <w:r>
-        <w:rPr>
-          <w:rFonts w:ascii="Georgia" w:hAnsi="Georgia" w:eastAsia="Georgia"/>
-          <w:b w:val="0"/>
-          <w:i w:val="0"/>
-          <w:sz w:val="22"/>
-        </w:rPr>
-      </w:r>
-      <w:r>
-        <w:rPr>
-          <w:rFonts w:ascii="Georgia" w:hAnsi="Georgia" w:cs="Georgia"/>
-          <w:b w:val="0"/>
-          <w:sz w:val="22"/>
-        </w:rPr>
-        <w:t>generally / typically → hedge when limiting the scope of a claim; not a hedge when describing a procedural norm.</w:t>
-      </w:r>
-    </w:p>
-    <w:p>
-      <w:pPr>
-        <w:keepNext/>
-        <w:keepLines/>
-        <w:spacing w:before="240" w:after="240" w:line="480" w:lineRule="auto"/>
-        <w:jc w:val="left"/>
-      </w:pPr>
-      <w:r>
-        <w:rPr>
-          <w:rFonts w:ascii="Georgia" w:hAnsi="Georgia" w:eastAsia="Georgia"/>
-          <w:b w:val="0"/>
-          <w:i/>
-          <w:sz w:val="24"/>
-        </w:rPr>
-      </w:r>
-      <w:r>
-        <w:rPr>
-          <w:rFonts w:ascii="Georgia" w:hAnsi="Georgia" w:cs="Georgia"/>
-          <w:b w:val="0"/>
-          <w:sz w:val="22"/>
-        </w:rPr>
-        <w:t>appear / seem → hedge when expressing uncertainty about a result; not a hedge when pointing to location in a table or text.</w:t>
-      </w:r>
-    </w:p>
-    <w:p>
-      <w:pPr>
-        <w:spacing w:line="480" w:lineRule="auto" w:before="0" w:after="0"/>
-        <w:ind w:firstLine="720"/>
-        <w:jc w:val="left"/>
-      </w:pPr>
-      <w:r>
-        <w:rPr>
-          <w:rFonts w:ascii="Georgia" w:hAnsi="Georgia" w:eastAsia="Georgia"/>
-          <w:b w:val="0"/>
           <w:i w:val="0"/>
           <w:sz w:val="22"/>
         </w:rPr>
@@ -7844,7 +7850,7 @@
     </w:p>
     <w:p>
       <w:pPr>
-        <w:spacing w:before="0" w:after="0" w:line="240" w:lineRule="auto"/>
+        <w:spacing w:before="0" w:after="120" w:line="240" w:lineRule="auto"/>
         <w:jc w:val="left"/>
       </w:pPr>
       <w:r>
@@ -7866,7 +7872,7 @@
     </w:p>
     <w:p>
       <w:pPr>
-        <w:spacing w:before="0" w:after="0" w:line="480" w:lineRule="auto"/>
+        <w:spacing w:before="320" w:after="160" w:line="240" w:lineRule="auto"/>
         <w:jc w:val="left"/>
       </w:pPr>
       <w:r>
@@ -7903,7 +7909,7 @@
       <w:pPr>
         <w:keepNext/>
         <w:keepLines/>
-        <w:spacing w:before="240" w:after="240" w:line="480" w:lineRule="auto"/>
+        <w:spacing w:before="200" w:after="80" w:line="240" w:lineRule="auto"/>
         <w:jc w:val="left"/>
       </w:pPr>
       <w:r>
@@ -7918,7 +7924,7 @@
     </w:p>
     <w:p>
       <w:pPr>
-        <w:spacing w:line="480" w:lineRule="auto" w:before="0" w:after="0"/>
+        <w:spacing w:line="240" w:lineRule="auto" w:before="0" w:after="120"/>
         <w:ind w:firstLine="720"/>
         <w:jc w:val="left"/>
       </w:pPr>
@@ -7943,7 +7949,7 @@
       <w:pPr>
         <w:keepNext/>
         <w:keepLines/>
-        <w:spacing w:before="240" w:after="240" w:line="480" w:lineRule="auto"/>
+        <w:spacing w:before="200" w:after="80" w:line="240" w:lineRule="auto"/>
         <w:jc w:val="left"/>
       </w:pPr>
       <w:r>
@@ -7958,7 +7964,7 @@
     </w:p>
     <w:p>
       <w:pPr>
-        <w:spacing w:line="480" w:lineRule="auto" w:before="0" w:after="0"/>
+        <w:spacing w:line="240" w:lineRule="auto" w:before="0" w:after="120"/>
         <w:ind w:firstLine="720"/>
         <w:jc w:val="both"/>
       </w:pPr>
@@ -7995,7 +8001,7 @@
     </w:p>
     <w:p>
       <w:pPr>
-        <w:spacing w:line="480" w:lineRule="auto" w:before="0" w:after="0"/>
+        <w:spacing w:line="240" w:lineRule="auto" w:before="0" w:after="120"/>
         <w:ind w:firstLine="720"/>
         <w:jc w:val="both"/>
       </w:pPr>
@@ -8011,7 +8017,7 @@
     </w:p>
     <w:p>
       <w:pPr>
-        <w:spacing w:line="480" w:lineRule="auto" w:before="0" w:after="0"/>
+        <w:spacing w:line="240" w:lineRule="auto" w:before="0" w:after="120"/>
         <w:ind w:firstLine="720"/>
         <w:jc w:val="both"/>
       </w:pPr>
@@ -8068,7 +8074,7 @@
     </w:p>
     <w:p>
       <w:pPr>
-        <w:spacing w:line="480" w:lineRule="auto" w:before="0" w:after="0"/>
+        <w:spacing w:line="240" w:lineRule="auto" w:before="0" w:after="120"/>
         <w:ind w:firstLine="720"/>
         <w:jc w:val="both"/>
       </w:pPr>
@@ -8086,7 +8092,7 @@
       <w:pPr>
         <w:keepNext/>
         <w:keepLines/>
-        <w:spacing w:before="240" w:after="240" w:line="480" w:lineRule="auto"/>
+        <w:spacing w:before="200" w:after="80" w:line="240" w:lineRule="auto"/>
         <w:jc w:val="left"/>
       </w:pPr>
       <w:r>
@@ -8101,7 +8107,7 @@
     </w:p>
     <w:p>
       <w:pPr>
-        <w:spacing w:line="480" w:lineRule="auto" w:before="0" w:after="0"/>
+        <w:spacing w:line="240" w:lineRule="auto" w:before="0" w:after="120"/>
         <w:ind w:firstLine="720"/>
         <w:jc w:val="both"/>
       </w:pPr>
@@ -8668,7 +8674,7 @@
     </w:p>
     <w:p>
       <w:pPr>
-        <w:spacing w:line="480" w:lineRule="auto"/>
+        <w:spacing w:line="240" w:lineRule="auto" w:before="0" w:after="120"/>
         <w:ind w:firstLine="720"/>
         <w:jc w:val="both"/>
       </w:pPr>
@@ -8705,7 +8711,7 @@
     </w:p>
     <w:p>
       <w:pPr>
-        <w:spacing w:line="480" w:lineRule="auto"/>
+        <w:spacing w:line="240" w:lineRule="auto" w:before="0" w:after="120"/>
         <w:ind w:firstLine="720"/>
         <w:jc w:val="both"/>
       </w:pPr>
@@ -8874,7 +8880,7 @@
       <w:pPr>
         <w:keepNext/>
         <w:keepLines/>
-        <w:spacing w:before="240" w:after="240" w:line="480" w:lineRule="auto"/>
+        <w:spacing w:before="200" w:after="80" w:line="240" w:lineRule="auto"/>
         <w:jc w:val="left"/>
       </w:pPr>
       <w:r>
@@ -8889,7 +8895,7 @@
     </w:p>
     <w:p>
       <w:pPr>
-        <w:spacing w:line="480" w:lineRule="auto" w:before="0" w:after="0"/>
+        <w:spacing w:line="240" w:lineRule="auto" w:before="0" w:after="120"/>
         <w:ind w:firstLine="720"/>
         <w:jc w:val="both"/>
       </w:pPr>
@@ -9401,7 +9407,7 @@
       <w:pPr>
         <w:keepNext/>
         <w:keepLines/>
-        <w:spacing w:before="240" w:after="240" w:line="480" w:lineRule="auto"/>
+        <w:spacing w:before="200" w:after="80" w:line="240" w:lineRule="auto"/>
         <w:jc w:val="left"/>
       </w:pPr>
       <w:r>
@@ -9416,7 +9422,7 @@
     </w:p>
     <w:p>
       <w:pPr>
-        <w:spacing w:line="480" w:lineRule="auto" w:before="0" w:after="0"/>
+        <w:spacing w:line="240" w:lineRule="auto" w:before="0" w:after="120"/>
         <w:ind w:firstLine="720"/>
         <w:jc w:val="both"/>
       </w:pPr>
@@ -10053,7 +10059,7 @@
     </w:p>
     <w:p>
       <w:pPr>
-        <w:spacing w:line="480" w:lineRule="auto"/>
+        <w:spacing w:line="240" w:lineRule="auto" w:before="0" w:after="120"/>
         <w:ind w:firstLine="720"/>
         <w:jc w:val="both"/>
       </w:pPr>
@@ -10080,7 +10086,7 @@
     </w:p>
     <w:p>
       <w:pPr>
-        <w:spacing w:line="480" w:lineRule="auto"/>
+        <w:spacing w:line="240" w:lineRule="auto" w:before="0" w:after="120"/>
         <w:ind w:firstLine="720"/>
         <w:jc w:val="both"/>
       </w:pPr>
@@ -10119,7 +10125,7 @@
       <w:pPr>
         <w:keepNext/>
         <w:keepLines/>
-        <w:spacing w:before="240" w:after="240" w:line="480" w:lineRule="auto"/>
+        <w:spacing w:before="200" w:after="80" w:line="240" w:lineRule="auto"/>
         <w:jc w:val="left"/>
       </w:pPr>
       <w:r>
@@ -10134,7 +10140,7 @@
     </w:p>
     <w:p>
       <w:pPr>
-        <w:spacing w:line="480" w:lineRule="auto" w:before="0" w:after="0"/>
+        <w:spacing w:line="240" w:lineRule="auto" w:before="0" w:after="120"/>
         <w:ind w:firstLine="720"/>
         <w:jc w:val="both"/>
       </w:pPr>
@@ -10680,7 +10686,7 @@
       <w:pPr>
         <w:keepNext/>
         <w:keepLines/>
-        <w:spacing w:before="240" w:after="240" w:line="480" w:lineRule="auto"/>
+        <w:spacing w:before="200" w:after="80" w:line="240" w:lineRule="auto"/>
         <w:jc w:val="left"/>
       </w:pPr>
       <w:r>
@@ -10695,7 +10701,7 @@
     </w:p>
     <w:p>
       <w:pPr>
-        <w:spacing w:line="480" w:lineRule="auto" w:before="0" w:after="0"/>
+        <w:spacing w:line="240" w:lineRule="auto" w:before="0" w:after="120"/>
         <w:ind w:firstLine="720"/>
         <w:jc w:val="both"/>
       </w:pPr>
@@ -11185,7 +11191,7 @@
       <w:pPr>
         <w:keepNext/>
         <w:keepLines/>
-        <w:spacing w:before="240" w:after="240" w:line="480" w:lineRule="auto"/>
+        <w:spacing w:before="200" w:after="80" w:line="240" w:lineRule="auto"/>
         <w:jc w:val="left"/>
       </w:pPr>
       <w:r>
@@ -11200,7 +11206,7 @@
     </w:p>
     <w:p>
       <w:pPr>
-        <w:spacing w:line="480" w:lineRule="auto" w:before="0" w:after="0"/>
+        <w:spacing w:line="240" w:lineRule="auto" w:before="0" w:after="120"/>
         <w:ind w:firstLine="720"/>
         <w:jc w:val="both"/>
       </w:pPr>
@@ -11564,7 +11570,7 @@
       <w:pPr>
         <w:keepNext/>
         <w:keepLines/>
-        <w:spacing w:before="240" w:after="240" w:line="480" w:lineRule="auto"/>
+        <w:spacing w:before="200" w:after="80" w:line="240" w:lineRule="auto"/>
         <w:jc w:val="left"/>
       </w:pPr>
       <w:r>
@@ -11579,7 +11585,7 @@
     </w:p>
     <w:p>
       <w:pPr>
-        <w:spacing w:line="480" w:lineRule="auto" w:before="0" w:after="0"/>
+        <w:spacing w:line="240" w:lineRule="auto" w:before="0" w:after="120"/>
         <w:ind w:firstLine="720"/>
         <w:jc w:val="both"/>
       </w:pPr>
@@ -11768,7 +11774,7 @@
     </w:p>
     <w:p>
       <w:pPr>
-        <w:spacing w:line="480" w:lineRule="auto" w:before="0" w:after="0"/>
+        <w:spacing w:line="240" w:lineRule="auto" w:before="0" w:after="120"/>
         <w:ind w:firstLine="720"/>
         <w:jc w:val="both"/>
       </w:pPr>
@@ -11787,7 +11793,7 @@
       <w:pPr>
         <w:keepNext/>
         <w:keepLines/>
-        <w:spacing w:before="240" w:after="240" w:line="480" w:lineRule="auto"/>
+        <w:spacing w:before="200" w:after="80" w:line="240" w:lineRule="auto"/>
         <w:jc w:val="left"/>
       </w:pPr>
       <w:r>
@@ -11802,7 +11808,7 @@
     </w:p>
     <w:p>
       <w:pPr>
-        <w:spacing w:line="480" w:lineRule="auto" w:before="0" w:after="0"/>
+        <w:spacing w:line="240" w:lineRule="auto" w:before="0" w:after="120"/>
         <w:ind w:firstLine="720"/>
         <w:jc w:val="both"/>
       </w:pPr>
@@ -12186,7 +12192,7 @@
     </w:p>
     <w:p>
       <w:pPr>
-        <w:spacing w:line="480" w:lineRule="auto"/>
+        <w:spacing w:line="240" w:lineRule="auto" w:before="0" w:after="120"/>
         <w:ind w:firstLine="720"/>
         <w:jc w:val="both"/>
       </w:pPr>
@@ -12203,7 +12209,7 @@
     </w:p>
     <w:p>
       <w:pPr>
-        <w:spacing w:line="480" w:lineRule="auto"/>
+        <w:spacing w:line="240" w:lineRule="auto" w:before="0" w:after="120"/>
         <w:ind w:firstLine="720"/>
         <w:jc w:val="both"/>
       </w:pPr>
@@ -12222,7 +12228,7 @@
       <w:pPr>
         <w:keepNext/>
         <w:keepLines/>
-        <w:spacing w:before="240" w:after="240" w:line="480" w:lineRule="auto"/>
+        <w:spacing w:before="0" w:after="120" w:line="240" w:lineRule="auto"/>
         <w:jc w:val="left"/>
       </w:pPr>
       <w:r>
@@ -12512,7 +12518,7 @@
       <w:pPr>
         <w:keepNext/>
         <w:keepLines/>
-        <w:spacing w:before="240" w:after="240" w:line="480" w:lineRule="auto"/>
+        <w:spacing w:before="0" w:after="120" w:line="240" w:lineRule="auto"/>
         <w:jc w:val="left"/>
       </w:pPr>
       <w:r>
@@ -12527,7 +12533,7 @@
     </w:p>
     <w:p>
       <w:pPr>
-        <w:spacing w:line="480" w:lineRule="auto" w:before="0" w:after="0"/>
+        <w:spacing w:line="240" w:lineRule="auto" w:before="0" w:after="120"/>
         <w:ind w:firstLine="720"/>
         <w:jc w:val="both"/>
       </w:pPr>
@@ -12816,6 +12822,7 @@
     </w:tbl>
     <w:p>
       <w:pPr>
+        <w:spacing w:before="0" w:after="0" w:line="240" w:lineRule="auto"/>
         <w:sectPr>
           <w:headerReference w:type="default" r:id="rId22"/>
           <w:headerReference w:type="first" r:id="rId23"/>
@@ -12869,7 +12876,7 @@
     <w:p>
       <w:pPr>
         <w:pageBreakBefore/>
-        <w:spacing w:before="0" w:after="0" w:line="480" w:lineRule="auto"/>
+        <w:spacing w:before="360" w:after="200" w:line="240" w:lineRule="auto"/>
         <w:jc w:val="center"/>
       </w:pPr>
       <w:r>
@@ -12897,7 +12904,7 @@
     </w:p>
     <w:p>
       <w:pPr>
-        <w:spacing w:line="480" w:lineRule="auto" w:before="0" w:after="0"/>
+        <w:spacing w:line="240" w:lineRule="auto" w:before="0" w:after="120"/>
         <w:ind w:firstLine="720"/>
         <w:jc w:val="left"/>
       </w:pPr>
@@ -12922,13 +12929,13 @@
       <w:pPr>
         <w:keepNext/>
         <w:keepLines/>
-        <w:spacing w:before="240" w:after="240" w:line="480" w:lineRule="auto"/>
+        <w:spacing w:before="200" w:after="80" w:line="240" w:lineRule="auto"/>
         <w:jc w:val="left"/>
       </w:pPr>
       <w:r>
         <w:rPr>
           <w:rFonts w:ascii="Georgia" w:hAnsi="Georgia" w:eastAsia="Georgia"/>
-          <w:b w:val="0"/>
+          <w:b/>
           <w:i/>
           <w:sz w:val="24"/>
         </w:rPr>
@@ -12937,7 +12944,7 @@
     </w:p>
     <w:p>
       <w:pPr>
-        <w:spacing w:line="480" w:lineRule="auto" w:before="0" w:after="0"/>
+        <w:spacing w:line="240" w:lineRule="auto" w:before="0" w:after="120"/>
         <w:ind w:firstLine="720"/>
         <w:jc w:val="both"/>
       </w:pPr>
@@ -12953,7 +12960,7 @@
     </w:p>
     <w:p>
       <w:pPr>
-        <w:spacing w:line="480" w:lineRule="auto" w:before="0" w:after="0"/>
+        <w:spacing w:line="240" w:lineRule="auto" w:before="0" w:after="120"/>
         <w:ind w:firstLine="720"/>
         <w:jc w:val="both"/>
       </w:pPr>
@@ -12969,7 +12976,7 @@
     </w:p>
     <w:p>
       <w:pPr>
-        <w:spacing w:line="480" w:lineRule="auto" w:before="0" w:after="0"/>
+        <w:spacing w:line="240" w:lineRule="auto" w:before="0" w:after="120"/>
         <w:ind w:firstLine="720"/>
         <w:jc w:val="both"/>
       </w:pPr>
@@ -12985,7 +12992,7 @@
     </w:p>
     <w:p>
       <w:pPr>
-        <w:spacing w:line="480" w:lineRule="auto" w:before="0" w:after="0"/>
+        <w:spacing w:line="240" w:lineRule="auto" w:before="0" w:after="120"/>
         <w:ind w:firstLine="720"/>
         <w:jc w:val="both"/>
       </w:pPr>
@@ -13473,7 +13480,7 @@
     </w:p>
     <w:p>
       <w:pPr>
-        <w:spacing w:before="0" w:after="0" w:line="480" w:lineRule="auto"/>
+        <w:spacing w:before="360" w:after="200" w:line="240" w:lineRule="auto"/>
         <w:jc w:val="center"/>
       </w:pPr>
       <w:r>

</xml_diff>

<commit_message>
Remove blank page between Appendix A and B
Dropped pageBreakBefore on Appendix B and empty section-break
paragraphs that left page 54 blank.
</commit_message>
<xml_diff>
--- a/thesis/003_ThesisProposal_Draft_009.docx
+++ b/thesis/003_ThesisProposal_Draft_009.docx
@@ -12822,60 +12822,6 @@
     </w:tbl>
     <w:p>
       <w:pPr>
-        <w:spacing w:before="0" w:after="0" w:line="240" w:lineRule="auto"/>
-        <w:sectPr>
-          <w:headerReference w:type="default" r:id="rId22"/>
-          <w:headerReference w:type="first" r:id="rId23"/>
-          <w:pgSz w:w="11906" w:h="16838"/>
-          <w:pgMar w:top="1440" w:right="1440" w:bottom="1440" w:left="2160" w:header="720" w:footer="720" w:gutter="0"/>
-          <w:cols w:space="720"/>
-          <w:titlePg/>
-          <w:docGrid w:linePitch="360"/>
-        </w:sectPr>
-      </w:pPr>
-    </w:p>
-    <w:p>
-      <w:pPr>
-        <w:spacing w:before="0" w:after="0" w:line="240" w:lineRule="auto"/>
-      </w:pPr>
-      <w:r>
-        <w:rPr>
-          <w:rFonts w:ascii="Georgia" w:hAnsi="Georgia" w:eastAsia="Georgia"/>
-          <w:b w:val="0"/>
-          <w:i w:val="0"/>
-          <w:sz w:val="22"/>
-        </w:rPr>
-      </w:r>
-    </w:p>
-    <w:p>
-      <w:pPr>
-        <w:spacing w:before="0" w:after="0" w:line="240" w:lineRule="auto"/>
-      </w:pPr>
-      <w:r>
-        <w:rPr>
-          <w:rFonts w:ascii="Georgia" w:hAnsi="Georgia" w:eastAsia="Georgia"/>
-          <w:b w:val="0"/>
-          <w:i w:val="0"/>
-          <w:sz w:val="22"/>
-        </w:rPr>
-      </w:r>
-    </w:p>
-    <w:p>
-      <w:pPr>
-        <w:spacing w:before="0" w:after="0" w:line="240" w:lineRule="auto"/>
-      </w:pPr>
-      <w:r>
-        <w:rPr>
-          <w:rFonts w:ascii="Georgia" w:hAnsi="Georgia" w:eastAsia="Georgia"/>
-          <w:b w:val="0"/>
-          <w:i w:val="0"/>
-          <w:sz w:val="22"/>
-        </w:rPr>
-      </w:r>
-    </w:p>
-    <w:p>
-      <w:pPr>
-        <w:pageBreakBefore/>
         <w:spacing w:before="360" w:after="200" w:line="240" w:lineRule="auto"/>
         <w:jc w:val="center"/>
       </w:pPr>

</xml_diff>

<commit_message>
Fix Kruskal-Wallis report: H≈5.91, p≈.052 (not significant)
Correct three body mentions that previously reported H=6.02, p=.049.
</commit_message>
<xml_diff>
--- a/thesis/003_ThesisProposal_Draft_009.docx
+++ b/thesis/003_ThesisProposal_Draft_009.docx
@@ -5303,7 +5303,7 @@
           <w:i w:val="0"/>
           <w:sz w:val="22"/>
         </w:rPr>
-        <w:t>Per-abstract hedge distributions reveal substantial skew. Agriculture abstracts averaged 1.30 hedges (median = 1, SD = 1.84, range = 0–8), Biology averaged 1.25 (median = 1, SD = 1.25, range = 0–4), and Veterinary Medicine averaged 0.45 (median = 0, SD = 0.76, range = 0–3). The high standard deviation in Agriculture reflects the influence of Acs2, which contained 8 hedges alone. When Acs2 is excluded as a sensitivity check, Agriculture's density drops to 0.44 per 100 words, below Biology's 0.55, suggesting that the Agriculture &gt; Biology ranking is partly driven by a single outlier abstract. An exploratory Kruskal-Wallis test on per-abstract hedge counts yielded H = 6.02, p = .049, suggesting a possible difference in the distribution of hedge counts across disciplines. Given the small sample size and zero-inflated distribution, this result should be treated as preliminary rather than as strong evidence of disciplinary differences.</w:t>
+        <w:t>Per-abstract hedge distributions reveal substantial skew. Agriculture abstracts averaged 1.30 hedges (median = 1, SD = 1.84, range = 0–8), Biology averaged 1.25 (median = 1, SD = 1.25, range = 0–4), and Veterinary Medicine averaged 0.45 (median = 0, SD = 0.76, range = 0–3). The high standard deviation in Agriculture reflects the influence of Acs2, which contained 8 hedges alone. When Acs2 is excluded as a sensitivity check, Agriculture's density drops to 0.44 per 100 words, below Biology's 0.55, suggesting that the Agriculture &gt; Biology ranking is partly driven by a single outlier abstract. An exploratory Kruskal-Wallis test on per-abstract hedge counts yielded H ≈ 5.91, p ≈ .052, suggesting a possible difference in the distribution of hedge counts across disciplines. Given the small sample size and zero-inflated distribution, this result should be treated as preliminary rather than as evidence of a significant disciplinary difference.</w:t>
       </w:r>
     </w:p>
     <w:p>
@@ -5784,7 +5784,7 @@
         <w:jc w:val="both"/>
       </w:pPr>
       <w:r>
-        <w:t>The frequency and functional patterns identified in Parts I through III reveal three observable patterns within this corpus. Given the small sample (n = 20 per discipline) and the borderline statistical support (Kruskal-Wallis p = .049; chi-square on zero-hedge distribution p = .13, which does not reach the conventional threshold of p &lt; .05), these patterns are exploratory observations rather than established typologies. The labels below describe what was observed in this corpus; they should not be read as stable discipline-level characteristics. Generalization beyond this corpus and beyond the three observed disciplines is not warranted. The patterns are interpreted through the lens of Salager-Meyer's (1994) claim-responsibility framework and Hyland's (2005) stance model.</w:t>
+        <w:t>The frequency and functional patterns identified in Parts I through III reveal three observable patterns within this corpus. Given the small sample (n = 20 per discipline) and the borderline statistical support (Kruskal-Wallis p ≈ .052; chi-square on zero-hedge distribution p = .13, neither of which reaches the conventional threshold of p &lt; .05), these patterns are exploratory observations rather than established typologies. The labels below describe what was observed in this corpus; they should not be read as stable discipline-level characteristics. Generalization beyond this corpus and beyond the three observed disciplines is not warranted. The patterns are interpreted through the lens of Salager-Meyer's (1994) claim-responsibility framework and Hyland's (2005) stance model.</w:t>
       </w:r>
     </w:p>
     <w:p>
@@ -6067,7 +6067,7 @@
           <w:i w:val="0"/>
           <w:sz w:val="22"/>
         </w:rPr>
-        <w:t xml:space="preserve">Disciplinary differentiation is present but uneven. Veterinary Medicine’s sparse, assertive profile is the clearest contrast. Agriculture’s edge over Biology is modest and sensitive to a single outlier. The patterns are consistent with field-specific epistemic demands (Salager-Meyer, 1994) operating even among developing writers, but statistical evidence is borderline (Kruskal-Wallis p = .049) and the sample is small. The study provides a local baseline, not a general law.</w:t>
+        <w:t>Disciplinary differentiation is present but uneven. Veterinary Medicine’s sparse, assertive profile is the clearest contrast. Agriculture’s edge over Biology is modest and sensitive to a single outlier. The patterns are consistent with field-specific epistemic demands (Salager-Meyer, 1994) operating even among developing writers, but statistical evidence is borderline (Kruskal-Wallis p ≈ .052) and the sample is small. The study provides a local baseline, not a general law.</w:t>
       </w:r>
     </w:p>
     <w:p>

</xml_diff>